<commit_message>
Tekst wykładu podzielony na 90 slajdów
- tekst_wykladu.docx: nagłówek „N. tytuł slajdu” dla każdego z 90 slajdów,
  pod nim oryginalne akapity bez zmian (tekst identyczny słowo w słowo,
  sześć akapitów rozdzielonych na granicach zdań)
- notatki prelegenta zgodne z docx: usunięta dopiska spoza tekstu (slajd 6)

Co-Authored-By: Claude Opus 5.5 <noreply@anthropic.com>
</commit_message>
<xml_diff>
--- a/tekst_wykladu.docx
+++ b/tekst_wykladu.docx
@@ -42,7 +42,7 @@
         <w:rPr>
           <w:rFonts w:eastAsia="Calibri" w:cs="Calibri"/>
         </w:rPr>
-        <w:t>1. Gdzie kończy się twarz?</w:t>
+        <w:t xml:space="preserve">1. Gdzie kończy się twarz?</w:t>
       </w:r>
     </w:p>
     <w:p>
@@ -114,6 +114,20 @@
     </w:p>
     <w:p>
       <w:pPr>
+        <w:pStyle w:val="Heading1"/>
+        <w:keepNext w:val="true"/>
+        <w:spacing w:before="360" w:after="80"/>
+        <w:rPr/>
+      </w:pPr>
+      <w:r>
+        <w:rPr>
+          <w:rFonts w:eastAsia="Calibri" w:cs="Calibri"/>
+        </w:rPr>
+        <w:t xml:space="preserve">2. Dla komputera zdjęcie to tabela liczb</w:t>
+      </w:r>
+    </w:p>
+    <w:p>
+      <w:pPr>
         <w:pStyle w:val="Normal"/>
         <w:keepNext w:val="false"/>
         <w:spacing w:lineRule="exact" w:line="300" w:before="0" w:after="160"/>
@@ -144,6 +158,20 @@
     </w:p>
     <w:p>
       <w:pPr>
+        <w:pStyle w:val="Heading1"/>
+        <w:keepNext w:val="true"/>
+        <w:spacing w:before="360" w:after="80"/>
+        <w:rPr/>
+      </w:pPr>
+      <w:r>
+        <w:rPr>
+          <w:rFonts w:eastAsia="Calibri" w:cs="Calibri"/>
+        </w:rPr>
+        <w:t xml:space="preserve">3. Gdzie kończy się twarz, a zaczynają włosy?</w:t>
+      </w:r>
+    </w:p>
+    <w:p>
+      <w:pPr>
         <w:pStyle w:val="Normal"/>
         <w:keepNext w:val="false"/>
         <w:spacing w:lineRule="exact" w:line="300" w:before="0" w:after="160"/>
@@ -163,6 +191,20 @@
     </w:p>
     <w:p>
       <w:pPr>
+        <w:pStyle w:val="Heading1"/>
+        <w:keepNext w:val="true"/>
+        <w:spacing w:before="360" w:after="80"/>
+        <w:rPr/>
+      </w:pPr>
+      <w:r>
+        <w:rPr>
+          <w:rFonts w:eastAsia="Calibri" w:cs="Calibri"/>
+        </w:rPr>
+        <w:t xml:space="preserve">4. Plan</w:t>
+      </w:r>
+    </w:p>
+    <w:p>
+      <w:pPr>
         <w:pStyle w:val="Normal"/>
         <w:keepNext w:val="false"/>
         <w:spacing w:lineRule="exact" w:line="300" w:before="0" w:after="160"/>
@@ -182,6 +224,20 @@
     </w:p>
     <w:p>
       <w:pPr>
+        <w:pStyle w:val="Heading1"/>
+        <w:keepNext w:val="true"/>
+        <w:spacing w:before="360" w:after="80"/>
+        <w:rPr/>
+      </w:pPr>
+      <w:r>
+        <w:rPr>
+          <w:rFonts w:eastAsia="Calibri" w:cs="Calibri"/>
+        </w:rPr>
+        <w:t xml:space="preserve">5. Te kolory będą wracać</w:t>
+      </w:r>
+    </w:p>
+    <w:p>
+      <w:pPr>
         <w:pStyle w:val="Normal"/>
         <w:keepNext w:val="false"/>
         <w:spacing w:lineRule="exact" w:line="300" w:before="0" w:after="160"/>
@@ -210,7 +266,7 @@
         <w:rPr>
           <w:rFonts w:eastAsia="Calibri" w:cs="Calibri"/>
         </w:rPr>
-        <w:t>2. Dwie twarze, czy wazon?</w:t>
+        <w:t xml:space="preserve">6. Dwie twarze, czy wazon?</w:t>
       </w:r>
     </w:p>
     <w:p>
@@ -253,6 +309,20 @@
     </w:p>
     <w:p>
       <w:pPr>
+        <w:pStyle w:val="Heading1"/>
+        <w:keepNext w:val="true"/>
+        <w:spacing w:before="360" w:after="80"/>
+        <w:rPr/>
+      </w:pPr>
+      <w:r>
+        <w:rPr>
+          <w:rFonts w:eastAsia="Calibri" w:cs="Calibri"/>
+        </w:rPr>
+        <w:t xml:space="preserve">7. Każdy piksel jest jednoznaczny</w:t>
+      </w:r>
+    </w:p>
+    <w:p>
+      <w:pPr>
         <w:pStyle w:val="Normal"/>
         <w:keepNext w:val="false"/>
         <w:spacing w:lineRule="exact" w:line="300" w:before="0" w:after="160"/>
@@ -272,6 +342,20 @@
     </w:p>
     <w:p>
       <w:pPr>
+        <w:pStyle w:val="Heading1"/>
+        <w:keepNext w:val="true"/>
+        <w:spacing w:before="360" w:after="80"/>
+        <w:rPr/>
+      </w:pPr>
+      <w:r>
+        <w:rPr>
+          <w:rFonts w:eastAsia="Calibri" w:cs="Calibri"/>
+        </w:rPr>
+        <w:t xml:space="preserve">8. Ktoś musi zdecydować, co jest obiektem</w:t>
+      </w:r>
+    </w:p>
+    <w:p>
+      <w:pPr>
         <w:pStyle w:val="Normal"/>
         <w:keepNext w:val="false"/>
         <w:spacing w:lineRule="exact" w:line="300" w:before="0" w:after="160"/>
@@ -319,7 +403,7 @@
         <w:rPr>
           <w:rFonts w:eastAsia="Calibri" w:cs="Calibri"/>
         </w:rPr>
-        <w:t>3. Segmentacja to funkcja etykietowania pikseli</w:t>
+        <w:t xml:space="preserve">9. Segmentacja: każdemu pikselowi etykieta</w:t>
       </w:r>
     </w:p>
     <w:p>
@@ -362,6 +446,20 @@
     </w:p>
     <w:p>
       <w:pPr>
+        <w:pStyle w:val="Heading1"/>
+        <w:keepNext w:val="true"/>
+        <w:spacing w:before="360" w:after="80"/>
+        <w:rPr/>
+      </w:pPr>
+      <w:r>
+        <w:rPr>
+          <w:rFonts w:eastAsia="Calibri" w:cs="Calibri"/>
+        </w:rPr>
+        <w:t xml:space="preserve">10. Kolorowanka z numerkami, tylko odwrotnie</w:t>
+      </w:r>
+    </w:p>
+    <w:p>
+      <w:pPr>
         <w:pStyle w:val="Normal"/>
         <w:keepNext w:val="false"/>
         <w:spacing w:lineRule="exact" w:line="300" w:before="0" w:after="160"/>
@@ -381,6 +479,20 @@
     </w:p>
     <w:p>
       <w:pPr>
+        <w:pStyle w:val="Heading1"/>
+        <w:keepNext w:val="true"/>
+        <w:spacing w:before="360" w:after="80"/>
+        <w:rPr/>
+      </w:pPr>
+      <w:r>
+        <w:rPr>
+          <w:rFonts w:eastAsia="Calibri" w:cs="Calibri"/>
+        </w:rPr>
+        <w:t xml:space="preserve">11. Najprostszy przykład: 6 × 6 pikseli, dwie kategorie</w:t>
+      </w:r>
+    </w:p>
+    <w:p>
+      <w:pPr>
         <w:pStyle w:val="Normal"/>
         <w:keepNext w:val="false"/>
         <w:spacing w:lineRule="exact" w:line="300" w:before="0" w:after="160"/>
@@ -400,21 +512,82 @@
     </w:p>
     <w:p>
       <w:pPr>
-        <w:pStyle w:val="Normal"/>
-        <w:keepNext w:val="false"/>
-        <w:spacing w:lineRule="exact" w:line="300" w:before="0" w:after="160"/>
-        <w:rPr/>
-      </w:pPr>
-      <w:r>
-        <w:rPr>
-          <w:rFonts w:eastAsia="Calibri" w:cs="Calibri"/>
-          <w:i w:val="false"/>
-          <w:iCs w:val="false"/>
-          <w:color w:val="1E2024"/>
-          <w:sz w:val="24"/>
-          <w:szCs w:val="24"/>
-        </w:rPr>
-        <w:t>Porównajmy to z dwoma zadaniami, które pewnie już znacie. Rozpoznawanie obrazu mówi: na tym zdjęciu jest twarz. Wykrywanie obiektów mówi: twarz jest w tym prostokącie. Segmentacja mówi: twarz to dokładnie te piksele, co do jednego. Dlatego można dzięki niej zrobić rzeczy, których prostokąt nie umożliwi: podmienić tło za osobą albo zmierzyć wielkość guza na zdjęciu z tomografu.</w:t>
+        <w:pStyle w:val="Heading1"/>
+        <w:keepNext w:val="true"/>
+        <w:spacing w:before="360" w:after="80"/>
+        <w:rPr/>
+      </w:pPr>
+      <w:r>
+        <w:rPr>
+          <w:rFonts w:eastAsia="Calibri" w:cs="Calibri"/>
+        </w:rPr>
+        <w:t xml:space="preserve">12. Rozpoznawanie, wykrywanie, segmentacja</w:t>
+      </w:r>
+    </w:p>
+    <w:p>
+      <w:pPr>
+        <w:pStyle w:val="Normal"/>
+        <w:keepNext w:val="false"/>
+        <w:spacing w:lineRule="exact" w:line="300" w:before="0" w:after="160"/>
+        <w:rPr/>
+      </w:pPr>
+      <w:r>
+        <w:rPr>
+          <w:rFonts w:eastAsia="Calibri" w:cs="Calibri"/>
+          <w:i w:val="false"/>
+          <w:iCs w:val="false"/>
+          <w:color w:val="1E2024"/>
+          <w:sz w:val="24"/>
+          <w:szCs w:val="24"/>
+        </w:rPr>
+        <w:t xml:space="preserve">Porównajmy to z dwoma zadaniami, które pewnie już znacie. Rozpoznawanie obrazu mówi: na tym zdjęciu jest twarz. Wykrywanie obiektów mówi: twarz jest w tym prostokącie. Segmentacja mówi: twarz to dokładnie te piksele, co do jednego.</w:t>
+      </w:r>
+    </w:p>
+    <w:p>
+      <w:pPr>
+        <w:pStyle w:val="Heading1"/>
+        <w:keepNext w:val="true"/>
+        <w:spacing w:before="360" w:after="80"/>
+        <w:rPr/>
+      </w:pPr>
+      <w:r>
+        <w:rPr>
+          <w:rFonts w:eastAsia="Calibri" w:cs="Calibri"/>
+        </w:rPr>
+        <w:t xml:space="preserve">13. Czego prostokąt nie umożliwi</w:t>
+      </w:r>
+    </w:p>
+    <w:p>
+      <w:pPr>
+        <w:pStyle w:val="Normal"/>
+        <w:keepNext w:val="false"/>
+        <w:spacing w:lineRule="exact" w:line="300" w:before="0" w:after="160"/>
+        <w:rPr/>
+      </w:pPr>
+      <w:r>
+        <w:rPr>
+          <w:rFonts w:eastAsia="Calibri" w:cs="Calibri"/>
+          <w:i w:val="false"/>
+          <w:iCs w:val="false"/>
+          <w:color w:val="1E2024"/>
+          <w:sz w:val="24"/>
+          <w:szCs w:val="24"/>
+        </w:rPr>
+        <w:t xml:space="preserve">Dlatego można dzięki niej zrobić rzeczy, których prostokąt nie umożliwi: podmienić tło za osobą albo zmierzyć wielkość guza na zdjęciu z tomografu.</w:t>
+      </w:r>
+    </w:p>
+    <w:p>
+      <w:pPr>
+        <w:pStyle w:val="Heading1"/>
+        <w:keepNext w:val="true"/>
+        <w:spacing w:before="360" w:after="80"/>
+        <w:rPr/>
+      </w:pPr>
+      <w:r>
+        <w:rPr>
+          <w:rFonts w:eastAsia="Calibri" w:cs="Calibri"/>
+        </w:rPr>
+        <w:t xml:space="preserve">14. Jedynka mówi „obiekt”, ale nie mówi który</w:t>
       </w:r>
     </w:p>
     <w:p>
@@ -447,7 +620,7 @@
         <w:rPr>
           <w:rFonts w:eastAsia="Calibri" w:cs="Calibri"/>
         </w:rPr>
-        <w:t>4. Trzy sposoby patrzenia na ten sam obraz</w:t>
+        <w:t xml:space="preserve">15. Ten sam obrazek: trzy owce na trawie</w:t>
       </w:r>
     </w:p>
     <w:p>
@@ -490,6 +663,20 @@
     </w:p>
     <w:p>
       <w:pPr>
+        <w:pStyle w:val="Heading1"/>
+        <w:keepNext w:val="true"/>
+        <w:spacing w:before="360" w:after="80"/>
+        <w:rPr/>
+      </w:pPr>
+      <w:r>
+        <w:rPr>
+          <w:rFonts w:eastAsia="Calibri" w:cs="Calibri"/>
+        </w:rPr>
+        <w:t xml:space="preserve">16. 1. Semantyczna: liczy się tylko rodzaj rzeczy</w:t>
+      </w:r>
+    </w:p>
+    <w:p>
+      <w:pPr>
         <w:pStyle w:val="Normal"/>
         <w:keepNext w:val="false"/>
         <w:spacing w:lineRule="exact" w:line="300" w:before="0" w:after="160"/>
@@ -509,6 +696,20 @@
     </w:p>
     <w:p>
       <w:pPr>
+        <w:pStyle w:val="Heading1"/>
+        <w:keepNext w:val="true"/>
+        <w:spacing w:before="360" w:after="80"/>
+        <w:rPr/>
+      </w:pPr>
+      <w:r>
+        <w:rPr>
+          <w:rFonts w:eastAsia="Calibri" w:cs="Calibri"/>
+        </w:rPr>
+        <w:t xml:space="preserve">17. 2. Instancyjna: każda owca osobno</w:t>
+      </w:r>
+    </w:p>
+    <w:p>
+      <w:pPr>
         <w:pStyle w:val="Normal"/>
         <w:keepNext w:val="false"/>
         <w:spacing w:lineRule="exact" w:line="300" w:before="0" w:after="160"/>
@@ -528,6 +729,20 @@
     </w:p>
     <w:p>
       <w:pPr>
+        <w:pStyle w:val="Heading1"/>
+        <w:keepNext w:val="true"/>
+        <w:spacing w:before="360" w:after="80"/>
+        <w:rPr/>
+      </w:pPr>
+      <w:r>
+        <w:rPr>
+          <w:rFonts w:eastAsia="Calibri" w:cs="Calibri"/>
+        </w:rPr>
+        <w:t xml:space="preserve">18. 3. Panoptyczna: wszystko naraz</w:t>
+      </w:r>
+    </w:p>
+    <w:p>
+      <w:pPr>
         <w:pStyle w:val="Normal"/>
         <w:keepNext w:val="false"/>
         <w:spacing w:lineRule="exact" w:line="300" w:before="0" w:after="160"/>
@@ -547,6 +762,20 @@
     </w:p>
     <w:p>
       <w:pPr>
+        <w:pStyle w:val="Heading1"/>
+        <w:keepNext w:val="true"/>
+        <w:spacing w:before="360" w:after="80"/>
+        <w:rPr/>
+      </w:pPr>
+      <w:r>
+        <w:rPr>
+          <w:rFonts w:eastAsia="Calibri" w:cs="Calibri"/>
+        </w:rPr>
+        <w:t xml:space="preserve">19. Który sposób wybrać? Zależy, do czego to służy</w:t>
+      </w:r>
+    </w:p>
+    <w:p>
+      <w:pPr>
         <w:pStyle w:val="Normal"/>
         <w:keepNext w:val="false"/>
         <w:spacing w:lineRule="exact" w:line="300" w:before="0" w:after="160"/>
@@ -575,7 +804,7 @@
         <w:rPr>
           <w:rFonts w:eastAsia="Calibri" w:cs="Calibri"/>
         </w:rPr>
-        <w:t>5. Warstwy czasu: jak dochodziliśmy do granic</w:t>
+        <w:t xml:space="preserve">20. Krótka historia, ułożona jak warstwy skał</w:t>
       </w:r>
     </w:p>
     <w:p>
@@ -613,45 +842,186 @@
           <w:sz w:val="24"/>
           <w:szCs w:val="24"/>
         </w:rPr>
-        <w:t>Teraz krótka historia, ułożona jak warstwy skał. Nowe metody nie wyrzuciły starych, tylko się na nich nadbudowały. Najstarsze wciąż się przydają, na przykład w fabrykach, gdzie kamera nad taśmą sprawdza, czy produkt ma właściwy kształt.</w:t>
-      </w:r>
-    </w:p>
-    <w:p>
-      <w:pPr>
-        <w:pStyle w:val="Normal"/>
-        <w:keepNext w:val="false"/>
-        <w:spacing w:lineRule="exact" w:line="300" w:before="0" w:after="160"/>
-        <w:rPr/>
-      </w:pPr>
-      <w:r>
-        <w:rPr>
-          <w:rFonts w:eastAsia="Calibri" w:cs="Calibri"/>
-          <w:i w:val="false"/>
-          <w:iCs w:val="false"/>
-          <w:color w:val="1E2024"/>
-          <w:sz w:val="24"/>
-          <w:szCs w:val="24"/>
-        </w:rPr>
-        <w:t>Najgłębsza warstwa, lata siedemdziesiąte: progowanie. Mówimy komputerowi, że wszystko jaśniejsze od pewnej wartości to obiekt, a reszta to tło. Świetnie działa, gdy ciemny przedmiot leży na jasnym stole. Gorzej, gdy świat jest bardziej skomplikowany.</w:t>
-      </w:r>
-    </w:p>
-    <w:p>
-      <w:pPr>
-        <w:pStyle w:val="Normal"/>
-        <w:keepNext w:val="false"/>
-        <w:spacing w:lineRule="exact" w:line="300" w:before="0" w:after="160"/>
-        <w:rPr/>
-      </w:pPr>
-      <w:r>
-        <w:rPr>
-          <w:rFonts w:eastAsia="Calibri" w:cs="Calibri"/>
-          <w:i w:val="false"/>
-          <w:iCs w:val="false"/>
-          <w:color w:val="1E2024"/>
-          <w:sz w:val="24"/>
-          <w:szCs w:val="24"/>
-        </w:rPr>
-        <w:t>Przełom lat osiemdziesiątych i dziewięćdziesiątych: aktywne kontury. Wyobraźcie sobie gumkę recepturkę, którą rzucamy wokół obiektu i która sama zaciska się na jego krawędziach. Albo metoda wododziałów: traktujemy obraz jak mapę górzystego terenu, zalewamy ją wodą i patrzymy, gdzie spotykają się jeziora.</w:t>
+        <w:t xml:space="preserve">Teraz krótka historia, ułożona jak warstwy skał. Nowe metody nie wyrzuciły starych, tylko się na nich nadbudowały.</w:t>
+      </w:r>
+    </w:p>
+    <w:p>
+      <w:pPr>
+        <w:pStyle w:val="Heading1"/>
+        <w:keepNext w:val="true"/>
+        <w:spacing w:before="360" w:after="80"/>
+        <w:rPr/>
+      </w:pPr>
+      <w:r>
+        <w:rPr>
+          <w:rFonts w:eastAsia="Calibri" w:cs="Calibri"/>
+        </w:rPr>
+        <w:t xml:space="preserve">21. Najstarsze warstwy wciąż pracują: kamera nad taśmą</w:t>
+      </w:r>
+    </w:p>
+    <w:p>
+      <w:pPr>
+        <w:pStyle w:val="Normal"/>
+        <w:keepNext w:val="false"/>
+        <w:spacing w:lineRule="exact" w:line="300" w:before="0" w:after="160"/>
+        <w:rPr/>
+      </w:pPr>
+      <w:r>
+        <w:rPr>
+          <w:rFonts w:eastAsia="Calibri" w:cs="Calibri"/>
+          <w:i w:val="false"/>
+          <w:iCs w:val="false"/>
+          <w:color w:val="1E2024"/>
+          <w:sz w:val="24"/>
+          <w:szCs w:val="24"/>
+        </w:rPr>
+        <w:t xml:space="preserve">Najstarsze wciąż się przydają, na przykład w fabrykach, gdzie kamera nad taśmą sprawdza, czy produkt ma właściwy kształt.</w:t>
+      </w:r>
+    </w:p>
+    <w:p>
+      <w:pPr>
+        <w:pStyle w:val="Heading1"/>
+        <w:keepNext w:val="true"/>
+        <w:spacing w:before="360" w:after="80"/>
+        <w:rPr/>
+      </w:pPr>
+      <w:r>
+        <w:rPr>
+          <w:rFonts w:eastAsia="Calibri" w:cs="Calibri"/>
+        </w:rPr>
+        <w:t xml:space="preserve">22. Progowanie: jedna liczba dzieli obraz na dwie części</w:t>
+      </w:r>
+    </w:p>
+    <w:p>
+      <w:pPr>
+        <w:pStyle w:val="Normal"/>
+        <w:keepNext w:val="false"/>
+        <w:spacing w:lineRule="exact" w:line="300" w:before="0" w:after="160"/>
+        <w:rPr/>
+      </w:pPr>
+      <w:r>
+        <w:rPr>
+          <w:rFonts w:eastAsia="Calibri" w:cs="Calibri"/>
+          <w:i w:val="false"/>
+          <w:iCs w:val="false"/>
+          <w:color w:val="1E2024"/>
+          <w:sz w:val="24"/>
+          <w:szCs w:val="24"/>
+        </w:rPr>
+        <w:t xml:space="preserve">Najgłębsza warstwa, lata siedemdziesiąte: progowanie. Mówimy komputerowi, że wszystko jaśniejsze od pewnej wartości to obiekt, a reszta to tło. Świetnie działa, gdy ciemny przedmiot leży na jasnym stole.</w:t>
+      </w:r>
+    </w:p>
+    <w:p>
+      <w:pPr>
+        <w:pStyle w:val="Heading1"/>
+        <w:keepNext w:val="true"/>
+        <w:spacing w:before="360" w:after="80"/>
+        <w:rPr/>
+      </w:pPr>
+      <w:r>
+        <w:rPr>
+          <w:rFonts w:eastAsia="Calibri" w:cs="Calibri"/>
+        </w:rPr>
+        <w:t xml:space="preserve">23. Gorzej, gdy świat jest bardziej skomplikowany</w:t>
+      </w:r>
+    </w:p>
+    <w:p>
+      <w:pPr>
+        <w:pStyle w:val="Normal"/>
+        <w:keepNext w:val="false"/>
+        <w:spacing w:lineRule="exact" w:line="300" w:before="0" w:after="160"/>
+        <w:rPr/>
+      </w:pPr>
+      <w:r>
+        <w:rPr>
+          <w:rFonts w:eastAsia="Calibri" w:cs="Calibri"/>
+          <w:i w:val="false"/>
+          <w:iCs w:val="false"/>
+          <w:color w:val="1E2024"/>
+          <w:sz w:val="24"/>
+          <w:szCs w:val="24"/>
+        </w:rPr>
+        <w:t xml:space="preserve">Gorzej, gdy świat jest bardziej skomplikowany.</w:t>
+      </w:r>
+    </w:p>
+    <w:p>
+      <w:pPr>
+        <w:pStyle w:val="Heading1"/>
+        <w:keepNext w:val="true"/>
+        <w:spacing w:before="360" w:after="80"/>
+        <w:rPr/>
+      </w:pPr>
+      <w:r>
+        <w:rPr>
+          <w:rFonts w:eastAsia="Calibri" w:cs="Calibri"/>
+        </w:rPr>
+        <w:t xml:space="preserve">24. Aktywne kontury: gumka recepturka</w:t>
+      </w:r>
+    </w:p>
+    <w:p>
+      <w:pPr>
+        <w:pStyle w:val="Normal"/>
+        <w:keepNext w:val="false"/>
+        <w:spacing w:lineRule="exact" w:line="300" w:before="0" w:after="160"/>
+        <w:rPr/>
+      </w:pPr>
+      <w:r>
+        <w:rPr>
+          <w:rFonts w:eastAsia="Calibri" w:cs="Calibri"/>
+          <w:i w:val="false"/>
+          <w:iCs w:val="false"/>
+          <w:color w:val="1E2024"/>
+          <w:sz w:val="24"/>
+          <w:szCs w:val="24"/>
+        </w:rPr>
+        <w:t xml:space="preserve">Przełom lat osiemdziesiątych i dziewięćdziesiątych: aktywne kontury. Wyobraźcie sobie gumkę recepturkę, którą rzucamy wokół obiektu i która sama zaciska się na jego krawędziach.</w:t>
+      </w:r>
+    </w:p>
+    <w:p>
+      <w:pPr>
+        <w:pStyle w:val="Heading1"/>
+        <w:keepNext w:val="true"/>
+        <w:spacing w:before="360" w:after="80"/>
+        <w:rPr/>
+      </w:pPr>
+      <w:r>
+        <w:rPr>
+          <w:rFonts w:eastAsia="Calibri" w:cs="Calibri"/>
+        </w:rPr>
+        <w:t xml:space="preserve">25. Wododziały: obraz jako górzysty teren zalewany wodą</w:t>
+      </w:r>
+    </w:p>
+    <w:p>
+      <w:pPr>
+        <w:pStyle w:val="Normal"/>
+        <w:keepNext w:val="false"/>
+        <w:spacing w:lineRule="exact" w:line="300" w:before="0" w:after="160"/>
+        <w:rPr/>
+      </w:pPr>
+      <w:r>
+        <w:rPr>
+          <w:rFonts w:eastAsia="Calibri" w:cs="Calibri"/>
+          <w:i w:val="false"/>
+          <w:iCs w:val="false"/>
+          <w:color w:val="1E2024"/>
+          <w:sz w:val="24"/>
+          <w:szCs w:val="24"/>
+        </w:rPr>
+        <w:t xml:space="preserve">Albo metoda wododziałów: traktujemy obraz jak mapę górzystego terenu, zalewamy ją wodą i patrzymy, gdzie spotykają się jeziora.</w:t>
+      </w:r>
+    </w:p>
+    <w:p>
+      <w:pPr>
+        <w:pStyle w:val="Heading1"/>
+        <w:keepNext w:val="true"/>
+        <w:spacing w:before="360" w:after="80"/>
+        <w:rPr/>
+      </w:pPr>
+      <w:r>
+        <w:rPr>
+          <w:rFonts w:eastAsia="Calibri" w:cs="Calibri"/>
+        </w:rPr>
+        <w:t xml:space="preserve">26. Lata 2000: komputer patrzy na cały obraz naraz</w:t>
       </w:r>
     </w:p>
     <w:p>
@@ -675,6 +1045,20 @@
     </w:p>
     <w:p>
       <w:pPr>
+        <w:pStyle w:val="Heading1"/>
+        <w:keepNext w:val="true"/>
+        <w:spacing w:before="360" w:after="80"/>
+        <w:rPr/>
+      </w:pPr>
+      <w:r>
+        <w:rPr>
+          <w:rFonts w:eastAsia="Calibri" w:cs="Calibri"/>
+        </w:rPr>
+        <w:t xml:space="preserve">27. Około 2012: sieć neuronowa na razie tylko pomaga</w:t>
+      </w:r>
+    </w:p>
+    <w:p>
+      <w:pPr>
         <w:pStyle w:val="Normal"/>
         <w:keepNext w:val="false"/>
         <w:spacing w:lineRule="exact" w:line="300" w:before="0" w:after="160"/>
@@ -694,6 +1078,20 @@
     </w:p>
     <w:p>
       <w:pPr>
+        <w:pStyle w:val="Heading1"/>
+        <w:keepNext w:val="true"/>
+        <w:spacing w:before="360" w:after="80"/>
+        <w:rPr/>
+      </w:pPr>
+      <w:r>
+        <w:rPr>
+          <w:rFonts w:eastAsia="Calibri" w:cs="Calibri"/>
+        </w:rPr>
+        <w:t xml:space="preserve">28. 2015: sieć uczy się segmentacji sama, od początku do końca</w:t>
+      </w:r>
+    </w:p>
+    <w:p>
+      <w:pPr>
         <w:pStyle w:val="Normal"/>
         <w:keepNext w:val="false"/>
         <w:spacing w:lineRule="exact" w:line="300" w:before="0" w:after="160"/>
@@ -722,7 +1120,7 @@
         <w:rPr>
           <w:rFonts w:eastAsia="Calibri" w:cs="Calibri"/>
         </w:rPr>
-        <w:t>6. FCN: klasyfikator zamieniony w mapę</w:t>
+        <w:t xml:space="preserve">29. FCN: odpowiedź dla każdego fragmentu obrazu</w:t>
       </w:r>
     </w:p>
     <w:p>
@@ -765,21 +1163,82 @@
     </w:p>
     <w:p>
       <w:pPr>
-        <w:pStyle w:val="Normal"/>
-        <w:keepNext w:val="false"/>
-        <w:spacing w:lineRule="exact" w:line="300" w:before="0" w:after="160"/>
-        <w:rPr/>
-      </w:pPr>
-      <w:r>
-        <w:rPr>
-          <w:rFonts w:eastAsia="Calibri" w:cs="Calibri"/>
-          <w:i w:val="false"/>
-          <w:iCs w:val="false"/>
-          <w:color w:val="1E2024"/>
-          <w:sz w:val="24"/>
-          <w:szCs w:val="24"/>
-        </w:rPr>
-        <w:t>Problem widać na diagramie. Po drodze sieć wielokrotnie zmniejsza obraz, bo tak łatwiej jej uchwycić całość. Zdjęcie 512 na 512 pikseli kurczy się do 16 na 16. To jak oglądanie Warszawy z samolotu: widać, gdzie jest rzeka, a gdzie centrum, ale pojedynczych ulic już nie.</w:t>
+        <w:pStyle w:val="Heading1"/>
+        <w:keepNext w:val="true"/>
+        <w:spacing w:before="360" w:after="80"/>
+        <w:rPr/>
+      </w:pPr>
+      <w:r>
+        <w:rPr>
+          <w:rFonts w:eastAsia="Calibri" w:cs="Calibri"/>
+        </w:rPr>
+        <w:t xml:space="preserve">30. Po drodze sieć wielokrotnie zmniejsza obraz</w:t>
+      </w:r>
+    </w:p>
+    <w:p>
+      <w:pPr>
+        <w:pStyle w:val="Normal"/>
+        <w:keepNext w:val="false"/>
+        <w:spacing w:lineRule="exact" w:line="300" w:before="0" w:after="160"/>
+        <w:rPr/>
+      </w:pPr>
+      <w:r>
+        <w:rPr>
+          <w:rFonts w:eastAsia="Calibri" w:cs="Calibri"/>
+          <w:i w:val="false"/>
+          <w:iCs w:val="false"/>
+          <w:color w:val="1E2024"/>
+          <w:sz w:val="24"/>
+          <w:szCs w:val="24"/>
+        </w:rPr>
+        <w:t xml:space="preserve">Problem widać na diagramie. Po drodze sieć wielokrotnie zmniejsza obraz, bo tak łatwiej jej uchwycić całość. Zdjęcie 512 na 512 pikseli kurczy się do 16 na 16.</w:t>
+      </w:r>
+    </w:p>
+    <w:p>
+      <w:pPr>
+        <w:pStyle w:val="Heading1"/>
+        <w:keepNext w:val="true"/>
+        <w:spacing w:before="360" w:after="80"/>
+        <w:rPr/>
+      </w:pPr>
+      <w:r>
+        <w:rPr>
+          <w:rFonts w:eastAsia="Calibri" w:cs="Calibri"/>
+        </w:rPr>
+        <w:t xml:space="preserve">31. Jak oglądanie Warszawy z samolotu</w:t>
+      </w:r>
+    </w:p>
+    <w:p>
+      <w:pPr>
+        <w:pStyle w:val="Normal"/>
+        <w:keepNext w:val="false"/>
+        <w:spacing w:lineRule="exact" w:line="300" w:before="0" w:after="160"/>
+        <w:rPr/>
+      </w:pPr>
+      <w:r>
+        <w:rPr>
+          <w:rFonts w:eastAsia="Calibri" w:cs="Calibri"/>
+          <w:i w:val="false"/>
+          <w:iCs w:val="false"/>
+          <w:color w:val="1E2024"/>
+          <w:sz w:val="24"/>
+          <w:szCs w:val="24"/>
+        </w:rPr>
+        <w:t xml:space="preserve">To jak oglądanie Warszawy z samolotu: widać, gdzie jest rzeka, a gdzie centrum, ale pojedynczych ulic już nie.</w:t>
+      </w:r>
+    </w:p>
+    <w:p>
+      <w:pPr>
+        <w:pStyle w:val="Heading1"/>
+        <w:keepNext w:val="true"/>
+        <w:spacing w:before="360" w:after="80"/>
+        <w:rPr/>
+      </w:pPr>
+      <w:r>
+        <w:rPr>
+          <w:rFonts w:eastAsia="Calibri" w:cs="Calibri"/>
+        </w:rPr>
+        <w:t xml:space="preserve">32. Odtwarzanie pełnej mapy: najpierw rozmazane plamy</w:t>
       </w:r>
     </w:p>
     <w:p>
@@ -803,6 +1262,20 @@
     </w:p>
     <w:p>
       <w:pPr>
+        <w:pStyle w:val="Heading1"/>
+        <w:keepNext w:val="true"/>
+        <w:spacing w:before="360" w:after="80"/>
+        <w:rPr/>
+      </w:pPr>
+      <w:r>
+        <w:rPr>
+          <w:rFonts w:eastAsia="Calibri" w:cs="Calibri"/>
+        </w:rPr>
+        <w:t xml:space="preserve">33. Napięcie, które będzie wracać</w:t>
+      </w:r>
+    </w:p>
+    <w:p>
+      <w:pPr>
         <w:pStyle w:val="Normal"/>
         <w:keepNext w:val="false"/>
         <w:spacing w:lineRule="exact" w:line="300" w:before="0" w:after="160"/>
@@ -831,7 +1304,7 @@
         <w:rPr>
           <w:rFonts w:eastAsia="Calibri" w:cs="Calibri"/>
         </w:rPr>
-        <w:t>7. U-Net: litera "U" i połączenia szkieletowe</w:t>
+        <w:t xml:space="preserve">34. Biologia: komórki z mikroskopu i tylko 30 zdjęć</w:t>
       </w:r>
     </w:p>
     <w:p>
@@ -874,6 +1347,20 @@
     </w:p>
     <w:p>
       <w:pPr>
+        <w:pStyle w:val="Heading1"/>
+        <w:keepNext w:val="true"/>
+        <w:spacing w:before="360" w:after="80"/>
+        <w:rPr/>
+      </w:pPr>
+      <w:r>
+        <w:rPr>
+          <w:rFonts w:eastAsia="Calibri" w:cs="Calibri"/>
+        </w:rPr>
+        <w:t xml:space="preserve">35. U-Net: sieć w kształcie litery U</w:t>
+      </w:r>
+    </w:p>
+    <w:p>
+      <w:pPr>
         <w:pStyle w:val="Normal"/>
         <w:keepNext w:val="false"/>
         <w:spacing w:lineRule="exact" w:line="300" w:before="0" w:after="160"/>
@@ -893,6 +1380,20 @@
     </w:p>
     <w:p>
       <w:pPr>
+        <w:pStyle w:val="Heading1"/>
+        <w:keepNext w:val="true"/>
+        <w:spacing w:before="360" w:after="80"/>
+        <w:rPr/>
+      </w:pPr>
+      <w:r>
+        <w:rPr>
+          <w:rFonts w:eastAsia="Calibri" w:cs="Calibri"/>
+        </w:rPr>
+        <w:t xml:space="preserve">36. Skróty przenoszą szczegóły prosto na drugą stronę</w:t>
+      </w:r>
+    </w:p>
+    <w:p>
+      <w:pPr>
         <w:pStyle w:val="Normal"/>
         <w:keepNext w:val="false"/>
         <w:spacing w:lineRule="exact" w:line="300" w:before="0" w:after="160"/>
@@ -912,6 +1413,20 @@
     </w:p>
     <w:p>
       <w:pPr>
+        <w:pStyle w:val="Heading1"/>
+        <w:keepNext w:val="true"/>
+        <w:spacing w:before="360" w:after="80"/>
+        <w:rPr/>
+      </w:pPr>
+      <w:r>
+        <w:rPr>
+          <w:rFonts w:eastAsia="Calibri" w:cs="Calibri"/>
+        </w:rPr>
+        <w:t xml:space="preserve">37. Sztuczka: to samo zdjęcie, wyginane na różne sposoby</w:t>
+      </w:r>
+    </w:p>
+    <w:p>
+      <w:pPr>
         <w:pStyle w:val="Normal"/>
         <w:keepNext w:val="false"/>
         <w:spacing w:lineRule="exact" w:line="300" w:before="0" w:after="160"/>
@@ -931,6 +1446,20 @@
     </w:p>
     <w:p>
       <w:pPr>
+        <w:pStyle w:val="Heading1"/>
+        <w:keepNext w:val="true"/>
+        <w:spacing w:before="360" w:after="80"/>
+        <w:rPr/>
+      </w:pPr>
+      <w:r>
+        <w:rPr>
+          <w:rFonts w:eastAsia="Calibri" w:cs="Calibri"/>
+        </w:rPr>
+        <w:t xml:space="preserve">38. U-Net dziś: od szpitala po generatory obrazów</w:t>
+      </w:r>
+    </w:p>
+    <w:p>
+      <w:pPr>
         <w:pStyle w:val="Normal"/>
         <w:keepNext w:val="false"/>
         <w:spacing w:lineRule="exact" w:line="300" w:before="0" w:after="160"/>
@@ -959,7 +1488,7 @@
         <w:rPr>
           <w:rFonts w:eastAsia="Calibri" w:cs="Calibri"/>
         </w:rPr>
-        <w:t>8. DeepLab: większe pole widzenia bez pulowania</w:t>
+        <w:t xml:space="preserve">39. A może w ogóle nie zmniejszać obrazu?</w:t>
       </w:r>
     </w:p>
     <w:p>
@@ -1002,6 +1531,20 @@
     </w:p>
     <w:p>
       <w:pPr>
+        <w:pStyle w:val="Heading1"/>
+        <w:keepNext w:val="true"/>
+        <w:spacing w:before="360" w:after="80"/>
+        <w:rPr/>
+      </w:pPr>
+      <w:r>
+        <w:rPr>
+          <w:rFonts w:eastAsia="Calibri" w:cs="Calibri"/>
+        </w:rPr>
+        <w:t xml:space="preserve">40. Ale jeden piksel nie powie, czym jest</w:t>
+      </w:r>
+    </w:p>
+    <w:p>
+      <w:pPr>
         <w:pStyle w:val="Normal"/>
         <w:keepNext w:val="false"/>
         <w:spacing w:lineRule="exact" w:line="300" w:before="0" w:after="160"/>
@@ -1021,6 +1564,20 @@
     </w:p>
     <w:p>
       <w:pPr>
+        <w:pStyle w:val="Heading1"/>
+        <w:keepNext w:val="true"/>
+        <w:spacing w:before="360" w:after="80"/>
+        <w:rPr/>
+      </w:pPr>
+      <w:r>
+        <w:rPr>
+          <w:rFonts w:eastAsia="Calibri" w:cs="Calibri"/>
+        </w:rPr>
+        <w:t xml:space="preserve">41. Filtr rozstawiony szerzej, jak rozciągnięta sieć rybacka</w:t>
+      </w:r>
+    </w:p>
+    <w:p>
+      <w:pPr>
         <w:pStyle w:val="Normal"/>
         <w:keepNext w:val="false"/>
         <w:spacing w:lineRule="exact" w:line="300" w:before="0" w:after="160"/>
@@ -1040,6 +1597,20 @@
     </w:p>
     <w:p>
       <w:pPr>
+        <w:pStyle w:val="Heading1"/>
+        <w:keepNext w:val="true"/>
+        <w:spacing w:before="360" w:after="80"/>
+        <w:rPr/>
+      </w:pPr>
+      <w:r>
+        <w:rPr>
+          <w:rFonts w:eastAsia="Calibri" w:cs="Calibri"/>
+        </w:rPr>
+        <w:t xml:space="preserve">42. Kilka filtrów o różnym rozstawie naraz</w:t>
+      </w:r>
+    </w:p>
+    <w:p>
+      <w:pPr>
         <w:pStyle w:val="Normal"/>
         <w:keepNext w:val="false"/>
         <w:spacing w:lineRule="exact" w:line="300" w:before="0" w:after="160"/>
@@ -1059,6 +1630,20 @@
     </w:p>
     <w:p>
       <w:pPr>
+        <w:pStyle w:val="Heading1"/>
+        <w:keepNext w:val="true"/>
+        <w:spacing w:before="360" w:after="80"/>
+        <w:rPr/>
+      </w:pPr>
+      <w:r>
+        <w:rPr>
+          <w:rFonts w:eastAsia="Calibri" w:cs="Calibri"/>
+        </w:rPr>
+        <w:t xml:space="preserve">43. Później DeepLab dostał część podobną do U-Netu</w:t>
+      </w:r>
+    </w:p>
+    <w:p>
+      <w:pPr>
         <w:pStyle w:val="Normal"/>
         <w:keepNext w:val="false"/>
         <w:spacing w:lineRule="exact" w:line="300" w:before="0" w:after="160"/>
@@ -1087,7 +1672,7 @@
         <w:rPr>
           <w:rFonts w:eastAsia="Calibri" w:cs="Calibri"/>
         </w:rPr>
-        <w:t>9. Mask R-CNN: najpierw „gdzie", potem „jak dokładnie"</w:t>
+        <w:t xml:space="preserve">44. Wróćmy do owiec: do której należy ten piksel?</w:t>
       </w:r>
     </w:p>
     <w:p>
@@ -1130,6 +1715,20 @@
     </w:p>
     <w:p>
       <w:pPr>
+        <w:pStyle w:val="Heading1"/>
+        <w:keepNext w:val="true"/>
+        <w:spacing w:before="360" w:after="80"/>
+        <w:rPr/>
+      </w:pPr>
+      <w:r>
+        <w:rPr>
+          <w:rFonts w:eastAsia="Calibri" w:cs="Calibri"/>
+        </w:rPr>
+        <w:t xml:space="preserve">45. Dwa kroki: najpierw „gdzie”, potem „jak dokładnie”</w:t>
+      </w:r>
+    </w:p>
+    <w:p>
+      <w:pPr>
         <w:pStyle w:val="Normal"/>
         <w:keepNext w:val="false"/>
         <w:spacing w:lineRule="exact" w:line="300" w:before="0" w:after="160"/>
@@ -1149,6 +1748,20 @@
     </w:p>
     <w:p>
       <w:pPr>
+        <w:pStyle w:val="Heading1"/>
+        <w:keepNext w:val="true"/>
+        <w:spacing w:before="360" w:after="80"/>
+        <w:rPr/>
+      </w:pPr>
+      <w:r>
+        <w:rPr>
+          <w:rFonts w:eastAsia="Calibri" w:cs="Calibri"/>
+        </w:rPr>
+        <w:t xml:space="preserve">46. Drobiazg: zaokrąglanie do najbliższej kratki</w:t>
+      </w:r>
+    </w:p>
+    <w:p>
+      <w:pPr>
         <w:pStyle w:val="Normal"/>
         <w:keepNext w:val="false"/>
         <w:spacing w:lineRule="exact" w:line="300" w:before="0" w:after="160"/>
@@ -1168,6 +1781,20 @@
     </w:p>
     <w:p>
       <w:pPr>
+        <w:pStyle w:val="Heading1"/>
+        <w:keepNext w:val="true"/>
+        <w:spacing w:before="360" w:after="80"/>
+        <w:rPr/>
+      </w:pPr>
+      <w:r>
+        <w:rPr>
+          <w:rFonts w:eastAsia="Calibri" w:cs="Calibri"/>
+        </w:rPr>
+        <w:t xml:space="preserve">47. Czasem największy postęp to znalezienie miejsca, w którym system po cichu gubi informację.</w:t>
+      </w:r>
+    </w:p>
+    <w:p>
+      <w:pPr>
         <w:pStyle w:val="Normal"/>
         <w:keepNext w:val="false"/>
         <w:spacing w:lineRule="exact" w:line="300" w:before="0" w:after="160"/>
@@ -1196,7 +1823,7 @@
         <w:rPr>
           <w:rFonts w:eastAsia="Calibri" w:cs="Calibri"/>
         </w:rPr>
-        <w:t>10. Transformery: segmentacja jako predykcja zbioru</w:t>
+        <w:t xml:space="preserve">48. Transformery (ok. 2020): odwrócone pytanie</w:t>
       </w:r>
     </w:p>
     <w:p>
@@ -1258,6 +1885,20 @@
     </w:p>
     <w:p>
       <w:pPr>
+        <w:pStyle w:val="Heading1"/>
+        <w:keepNext w:val="true"/>
+        <w:spacing w:before="360" w:after="80"/>
+        <w:rPr/>
+      </w:pPr>
+      <w:r>
+        <w:rPr>
+          <w:rFonts w:eastAsia="Calibri" w:cs="Calibri"/>
+        </w:rPr>
+        <w:t xml:space="preserve">49. Każda szuflada oddaje jedną maskę z podpisem</w:t>
+      </w:r>
+    </w:p>
+    <w:p>
+      <w:pPr>
         <w:pStyle w:val="Normal"/>
         <w:keepNext w:val="false"/>
         <w:spacing w:lineRule="exact" w:line="300" w:before="0" w:after="160"/>
@@ -1277,6 +1918,20 @@
     </w:p>
     <w:p>
       <w:pPr>
+        <w:pStyle w:val="Heading1"/>
+        <w:keepNext w:val="true"/>
+        <w:spacing w:before="360" w:after="80"/>
+        <w:rPr/>
+      </w:pPr>
+      <w:r>
+        <w:rPr>
+          <w:rFonts w:eastAsia="Calibri" w:cs="Calibri"/>
+        </w:rPr>
+        <w:t xml:space="preserve">50. Trzy rodzaje segmentacji = jeden model, inaczej odczytany</w:t>
+      </w:r>
+    </w:p>
+    <w:p>
+      <w:pPr>
         <w:pStyle w:val="Normal"/>
         <w:keepNext w:val="false"/>
         <w:spacing w:lineRule="exact" w:line="300" w:before="0" w:after="160"/>
@@ -1324,7 +1979,7 @@
         <w:rPr>
           <w:rFonts w:eastAsia="Calibri" w:cs="Calibri"/>
         </w:rPr>
-        <w:t>11. SAM: segmentacja na żądanie, bez douczania</w:t>
+        <w:t xml:space="preserve">51. SAM (Meta, 2023): nie ma listy</w:t>
       </w:r>
     </w:p>
     <w:p>
@@ -1386,6 +2041,20 @@
     </w:p>
     <w:p>
       <w:pPr>
+        <w:pStyle w:val="Heading1"/>
+        <w:keepNext w:val="true"/>
+        <w:spacing w:before="360" w:after="80"/>
+        <w:rPr/>
+      </w:pPr>
+      <w:r>
+        <w:rPr>
+          <w:rFonts w:eastAsia="Calibri" w:cs="Calibri"/>
+        </w:rPr>
+        <w:t xml:space="preserve">52. Jak pokazać, o co chodzi?</w:t>
+      </w:r>
+    </w:p>
+    <w:p>
+      <w:pPr>
         <w:pStyle w:val="Normal"/>
         <w:keepNext w:val="false"/>
         <w:spacing w:lineRule="exact" w:line="300" w:before="0" w:after="160"/>
@@ -1405,6 +2074,20 @@
     </w:p>
     <w:p>
       <w:pPr>
+        <w:pStyle w:val="Heading1"/>
+        <w:keepNext w:val="true"/>
+        <w:spacing w:before="360" w:after="80"/>
+        <w:rPr/>
+      </w:pPr>
+      <w:r>
+        <w:rPr>
+          <w:rFonts w:eastAsia="Calibri" w:cs="Calibri"/>
+        </w:rPr>
+        <w:t xml:space="preserve">53. Klik w okulary: ale co właściwie macie na myśli?</w:t>
+      </w:r>
+    </w:p>
+    <w:p>
+      <w:pPr>
         <w:pStyle w:val="Normal"/>
         <w:keepNext w:val="false"/>
         <w:spacing w:lineRule="exact" w:line="300" w:before="0" w:after="160"/>
@@ -1424,6 +2107,20 @@
     </w:p>
     <w:p>
       <w:pPr>
+        <w:pStyle w:val="Heading1"/>
+        <w:keepNext w:val="true"/>
+        <w:spacing w:before="360" w:after="80"/>
+        <w:rPr/>
+      </w:pPr>
+      <w:r>
+        <w:rPr>
+          <w:rFonts w:eastAsia="Calibri" w:cs="Calibri"/>
+        </w:rPr>
+        <w:t xml:space="preserve">54. Skąd ta wszechstronność? Z ogromu danych</w:t>
+      </w:r>
+    </w:p>
+    <w:p>
+      <w:pPr>
         <w:pStyle w:val="Normal"/>
         <w:keepNext w:val="false"/>
         <w:spacing w:lineRule="exact" w:line="300" w:before="0" w:after="160"/>
@@ -1443,6 +2140,20 @@
     </w:p>
     <w:p>
       <w:pPr>
+        <w:pStyle w:val="Heading1"/>
+        <w:keepNext w:val="true"/>
+        <w:spacing w:before="360" w:after="80"/>
+        <w:rPr/>
+      </w:pPr>
+      <w:r>
+        <w:rPr>
+          <w:rFonts w:eastAsia="Calibri" w:cs="Calibri"/>
+        </w:rPr>
+        <w:t xml:space="preserve">55. Ograniczenie: SAM wie gdzie, ale nie wie co</w:t>
+      </w:r>
+    </w:p>
+    <w:p>
+      <w:pPr>
         <w:pStyle w:val="Normal"/>
         <w:keepNext w:val="false"/>
         <w:spacing w:lineRule="exact" w:line="300" w:before="0" w:after="160"/>
@@ -1490,7 +2201,7 @@
         <w:rPr>
           <w:rFonts w:eastAsia="Calibri" w:cs="Calibri"/>
         </w:rPr>
-        <w:t>12. Czas na żywą kamerę</w:t>
+        <w:t xml:space="preserve">56. Czas na żywą kamerę</w:t>
       </w:r>
     </w:p>
     <w:p>
@@ -1552,6 +2263,20 @@
     </w:p>
     <w:p>
       <w:pPr>
+        <w:pStyle w:val="Heading1"/>
+        <w:keepNext w:val="true"/>
+        <w:spacing w:before="360" w:after="80"/>
+        <w:rPr/>
+      </w:pPr>
+      <w:r>
+        <w:rPr>
+          <w:rFonts w:eastAsia="Calibri" w:cs="Calibri"/>
+        </w:rPr>
+        <w:t xml:space="preserve">57. Tryb 1: klasyczny — zna tylko kolor</w:t>
+      </w:r>
+    </w:p>
+    <w:p>
+      <w:pPr>
         <w:pStyle w:val="Normal"/>
         <w:keepNext w:val="false"/>
         <w:spacing w:lineRule="exact" w:line="300" w:before="0" w:after="160"/>
@@ -1571,6 +2296,20 @@
     </w:p>
     <w:p>
       <w:pPr>
+        <w:pStyle w:val="Heading1"/>
+        <w:keepNext w:val="true"/>
+        <w:spacing w:before="360" w:after="80"/>
+        <w:rPr/>
+      </w:pPr>
+      <w:r>
+        <w:rPr>
+          <w:rFonts w:eastAsia="Calibri" w:cs="Calibri"/>
+        </w:rPr>
+        <w:t xml:space="preserve">58. Tryb 2: sieć od Google — rozumie, co widzi</w:t>
+      </w:r>
+    </w:p>
+    <w:p>
+      <w:pPr>
         <w:pStyle w:val="Normal"/>
         <w:keepNext w:val="false"/>
         <w:spacing w:lineRule="exact" w:line="300" w:before="0" w:after="160"/>
@@ -1590,6 +2329,20 @@
     </w:p>
     <w:p>
       <w:pPr>
+        <w:pStyle w:val="Heading1"/>
+        <w:keepNext w:val="true"/>
+        <w:spacing w:before="360" w:after="80"/>
+        <w:rPr/>
+      </w:pPr>
+      <w:r>
+        <w:rPr>
+          <w:rFonts w:eastAsia="Calibri" w:cs="Calibri"/>
+        </w:rPr>
+        <w:t xml:space="preserve">59. Tryb 3: 19 części twarzy, w tym okulary</w:t>
+      </w:r>
+    </w:p>
+    <w:p>
+      <w:pPr>
         <w:pStyle w:val="Normal"/>
         <w:keepNext w:val="false"/>
         <w:spacing w:lineRule="exact" w:line="300" w:before="0" w:after="160"/>
@@ -1605,6 +2358,20 @@
           <w:szCs w:val="24"/>
         </w:rPr>
         <w:t>Tryb trzeci, model, który zna 19 części twarzy: brwi, oczy, usta, uszy, włosy i okulary. Poproszę, żeby ochotnik zdjął okulary. Napis: brak okularów. A teraz je zakłada. Napis: okulary wykryte, a oprawka obrysowana na turkusowo. Nic tu nie jest doklejone. Model sam ocenia każdy piksel i stwierdza: to jest oprawka. Sprawdźmy, kiedy się pogubi: obrót głowy, zasłonięcie części twarzy dłonią, odsunięcie się od kamery.</w:t>
+      </w:r>
+    </w:p>
+    <w:p>
+      <w:pPr>
+        <w:pStyle w:val="Heading1"/>
+        <w:keepNext w:val="true"/>
+        <w:spacing w:before="360" w:after="80"/>
+        <w:rPr/>
+      </w:pPr>
+      <w:r>
+        <w:rPr>
+          <w:rFonts w:eastAsia="Calibri" w:cs="Calibri"/>
+        </w:rPr>
+        <w:t xml:space="preserve">60. Tryb 4: wszystkie trzy obok siebie</w:t>
       </w:r>
     </w:p>
     <w:p>
@@ -1656,7 +2423,7 @@
         <w:rPr>
           <w:rFonts w:eastAsia="Calibri" w:cs="Calibri"/>
         </w:rPr>
-        <w:t>13. Co właśnie zobaczyliście</w:t>
+        <w:t xml:space="preserve">61. Co właśnie zobaczyliście</w:t>
       </w:r>
     </w:p>
     <w:p>
@@ -1737,6 +2504,20 @@
     </w:p>
     <w:p>
       <w:pPr>
+        <w:pStyle w:val="Heading1"/>
+        <w:keepNext w:val="true"/>
+        <w:spacing w:before="360" w:after="80"/>
+        <w:rPr/>
+      </w:pPr>
+      <w:r>
+        <w:rPr>
+          <w:rFonts w:eastAsia="Calibri" w:cs="Calibri"/>
+        </w:rPr>
+        <w:t xml:space="preserve">62. Ten sam model, inaczej podany obraz</w:t>
+      </w:r>
+    </w:p>
+    <w:p>
+      <w:pPr>
         <w:pStyle w:val="Normal"/>
         <w:keepNext w:val="false"/>
         <w:spacing w:lineRule="exact" w:line="300" w:before="0" w:after="160"/>
@@ -1756,6 +2537,20 @@
     </w:p>
     <w:p>
       <w:pPr>
+        <w:pStyle w:val="Heading1"/>
+        <w:keepNext w:val="true"/>
+        <w:spacing w:before="360" w:after="80"/>
+        <w:rPr/>
+      </w:pPr>
+      <w:r>
+        <w:rPr>
+          <w:rFonts w:eastAsia="Calibri" w:cs="Calibri"/>
+        </w:rPr>
+        <w:t xml:space="preserve">63. Każda metoda inaczej rozumie, czym jest obiekt</w:t>
+      </w:r>
+    </w:p>
+    <w:p>
+      <w:pPr>
         <w:pStyle w:val="Normal"/>
         <w:keepNext w:val="false"/>
         <w:spacing w:lineRule="exact" w:line="300" w:before="0" w:after="160"/>
@@ -1803,7 +2598,7 @@
         <w:rPr>
           <w:rFonts w:eastAsia="Calibri" w:cs="Calibri"/>
         </w:rPr>
-        <w:t>14. Jedna predykcja, trzy różne liczby</w:t>
+        <w:t xml:space="preserve">64. Ocena: porównujemy model z człowiekiem</w:t>
       </w:r>
     </w:p>
     <w:p>
@@ -1865,6 +2660,20 @@
     </w:p>
     <w:p>
       <w:pPr>
+        <w:pStyle w:val="Heading1"/>
+        <w:keepNext w:val="true"/>
+        <w:spacing w:before="360" w:after="80"/>
+        <w:rPr/>
+      </w:pPr>
+      <w:r>
+        <w:rPr>
+          <w:rFonts w:eastAsia="Calibri" w:cs="Calibri"/>
+        </w:rPr>
+        <w:t xml:space="preserve">65. IoU: część wspólna podzielona przez całość</w:t>
+      </w:r>
+    </w:p>
+    <w:p>
+      <w:pPr>
         <w:pStyle w:val="Normal"/>
         <w:keepNext w:val="false"/>
         <w:spacing w:lineRule="exact" w:line="300" w:before="0" w:after="160"/>
@@ -1884,6 +2693,20 @@
     </w:p>
     <w:p>
       <w:pPr>
+        <w:pStyle w:val="Heading1"/>
+        <w:keepNext w:val="true"/>
+        <w:spacing w:before="360" w:after="80"/>
+        <w:rPr/>
+      </w:pPr>
+      <w:r>
+        <w:rPr>
+          <w:rFonts w:eastAsia="Calibri" w:cs="Calibri"/>
+        </w:rPr>
+        <w:t xml:space="preserve">66. Dice: prawie to samo, ale łagodniej</w:t>
+      </w:r>
+    </w:p>
+    <w:p>
+      <w:pPr>
         <w:pStyle w:val="Normal"/>
         <w:keepNext w:val="false"/>
         <w:spacing w:lineRule="exact" w:line="300" w:before="0" w:after="160"/>
@@ -1903,6 +2726,20 @@
     </w:p>
     <w:p>
       <w:pPr>
+        <w:pStyle w:val="Heading1"/>
+        <w:keepNext w:val="true"/>
+        <w:spacing w:before="360" w:after="80"/>
+        <w:rPr/>
+      </w:pPr>
+      <w:r>
+        <w:rPr>
+          <w:rFonts w:eastAsia="Calibri" w:cs="Calibri"/>
+        </w:rPr>
+        <w:t xml:space="preserve">67. Dokładność: brzmi najlepiej, jest najmniej uczciwa</w:t>
+      </w:r>
+    </w:p>
+    <w:p>
+      <w:pPr>
         <w:pStyle w:val="Normal"/>
         <w:keepNext w:val="false"/>
         <w:spacing w:lineRule="exact" w:line="300" w:before="0" w:after="160"/>
@@ -1950,7 +2787,7 @@
         <w:rPr>
           <w:rFonts w:eastAsia="Calibri" w:cs="Calibri"/>
         </w:rPr>
-        <w:t>15. Gdy 99% obrazu to „nic ciekawego"</w:t>
+        <w:t xml:space="preserve">68. Gdy 99% obrazu to „nic ciekawego”</w:t>
       </w:r>
     </w:p>
     <w:p>
@@ -1993,6 +2830,20 @@
     </w:p>
     <w:p>
       <w:pPr>
+        <w:pStyle w:val="Heading1"/>
+        <w:keepNext w:val="true"/>
+        <w:spacing w:before="360" w:after="80"/>
+        <w:rPr/>
+      </w:pPr>
+      <w:r>
+        <w:rPr>
+          <w:rFonts w:eastAsia="Calibri" w:cs="Calibri"/>
+        </w:rPr>
+        <w:t xml:space="preserve">69. Model, który zawsze mówi „tu nic nie ma”</w:t>
+      </w:r>
+    </w:p>
+    <w:p>
+      <w:pPr>
         <w:pStyle w:val="Normal"/>
         <w:keepNext w:val="false"/>
         <w:spacing w:lineRule="exact" w:line="300" w:before="0" w:after="160"/>
@@ -2012,6 +2863,20 @@
     </w:p>
     <w:p>
       <w:pPr>
+        <w:pStyle w:val="Heading1"/>
+        <w:keepNext w:val="true"/>
+        <w:spacing w:before="360" w:after="80"/>
+        <w:rPr/>
+      </w:pPr>
+      <w:r>
+        <w:rPr>
+          <w:rFonts w:eastAsia="Calibri" w:cs="Calibri"/>
+        </w:rPr>
+        <w:t xml:space="preserve">70. Ta sama pułapka w czasie nauki</w:t>
+      </w:r>
+    </w:p>
+    <w:p>
+      <w:pPr>
         <w:pStyle w:val="Normal"/>
         <w:keepNext w:val="false"/>
         <w:spacing w:lineRule="exact" w:line="300" w:before="0" w:after="160"/>
@@ -2031,6 +2896,20 @@
     </w:p>
     <w:p>
       <w:pPr>
+        <w:pStyle w:val="Heading1"/>
+        <w:keepNext w:val="true"/>
+        <w:spacing w:before="360" w:after="80"/>
+        <w:rPr/>
+      </w:pPr>
+      <w:r>
+        <w:rPr>
+          <w:rFonts w:eastAsia="Calibri" w:cs="Calibri"/>
+        </w:rPr>
+        <w:t xml:space="preserve">71. Jak sobie z tym radzić</w:t>
+      </w:r>
+    </w:p>
+    <w:p>
+      <w:pPr>
         <w:pStyle w:val="Normal"/>
         <w:keepNext w:val="false"/>
         <w:spacing w:lineRule="exact" w:line="300" w:before="0" w:after="160"/>
@@ -2078,7 +2957,7 @@
         <w:rPr>
           <w:rFonts w:eastAsia="Calibri" w:cs="Calibri"/>
         </w:rPr>
-        <w:t>16. Zbiory danych, na których to wszystko stoi</w:t>
+        <w:t xml:space="preserve">72. Cityscapes: zdjęcia ulic z ok. 50 miast</w:t>
       </w:r>
     </w:p>
     <w:p>
@@ -2140,6 +3019,20 @@
     </w:p>
     <w:p>
       <w:pPr>
+        <w:pStyle w:val="Heading1"/>
+        <w:keepNext w:val="true"/>
+        <w:spacing w:before="360" w:after="80"/>
+        <w:rPr/>
+      </w:pPr>
+      <w:r>
+        <w:rPr>
+          <w:rFonts w:eastAsia="Calibri" w:cs="Calibri"/>
+        </w:rPr>
+        <w:t xml:space="preserve">73. ADE20K i COCO-Stuff: przedmioty i tło</w:t>
+      </w:r>
+    </w:p>
+    <w:p>
+      <w:pPr>
         <w:pStyle w:val="Normal"/>
         <w:keepNext w:val="false"/>
         <w:spacing w:lineRule="exact" w:line="300" w:before="0" w:after="160"/>
@@ -2159,6 +3052,20 @@
     </w:p>
     <w:p>
       <w:pPr>
+        <w:pStyle w:val="Heading1"/>
+        <w:keepNext w:val="true"/>
+        <w:spacing w:before="360" w:after="80"/>
+        <w:rPr/>
+      </w:pPr>
+      <w:r>
+        <w:rPr>
+          <w:rFonts w:eastAsia="Calibri" w:cs="Calibri"/>
+        </w:rPr>
+        <w:t xml:space="preserve">74. CelebAMask-HQ: 30 000 twarzy, 19 części</w:t>
+      </w:r>
+    </w:p>
+    <w:p>
+      <w:pPr>
         <w:pStyle w:val="Normal"/>
         <w:keepNext w:val="false"/>
         <w:spacing w:lineRule="exact" w:line="300" w:before="0" w:after="160"/>
@@ -2178,6 +3085,20 @@
     </w:p>
     <w:p>
       <w:pPr>
+        <w:pStyle w:val="Heading1"/>
+        <w:keepNext w:val="true"/>
+        <w:spacing w:before="360" w:after="80"/>
+        <w:rPr/>
+      </w:pPr>
+      <w:r>
+        <w:rPr>
+          <w:rFonts w:eastAsia="Calibri" w:cs="Calibri"/>
+        </w:rPr>
+        <w:t xml:space="preserve">75. Ostrzeżenie: zdjęcia celebrytów</w:t>
+      </w:r>
+    </w:p>
+    <w:p>
+      <w:pPr>
         <w:pStyle w:val="Normal"/>
         <w:keepNext w:val="false"/>
         <w:spacing w:lineRule="exact" w:line="300" w:before="0" w:after="160"/>
@@ -2197,6 +3118,20 @@
     </w:p>
     <w:p>
       <w:pPr>
+        <w:pStyle w:val="Heading1"/>
+        <w:keepNext w:val="true"/>
+        <w:spacing w:before="360" w:after="80"/>
+        <w:rPr/>
+      </w:pPr>
+      <w:r>
+        <w:rPr>
+          <w:rFonts w:eastAsia="Calibri" w:cs="Calibri"/>
+        </w:rPr>
+        <w:t xml:space="preserve">76. Model widzi tylko to, co pokazały mu dane.</w:t>
+      </w:r>
+    </w:p>
+    <w:p>
+      <w:pPr>
         <w:pStyle w:val="Normal"/>
         <w:keepNext w:val="false"/>
         <w:spacing w:lineRule="exact" w:line="300" w:before="0" w:after="160"/>
@@ -2225,7 +3160,7 @@
         <w:rPr>
           <w:rFonts w:eastAsia="Calibri" w:cs="Calibri"/>
         </w:rPr>
-        <w:t>17. Czego jeszcze nie umiemy</w:t>
+        <w:t xml:space="preserve">77. Pięć rzeczy, z którymi segmentacja wciąż ma kłopot</w:t>
       </w:r>
     </w:p>
     <w:p>
@@ -2268,6 +3203,20 @@
     </w:p>
     <w:p>
       <w:pPr>
+        <w:pStyle w:val="Heading1"/>
+        <w:keepNext w:val="true"/>
+        <w:spacing w:before="360" w:after="80"/>
+        <w:rPr/>
+      </w:pPr>
+      <w:r>
+        <w:rPr>
+          <w:rFonts w:eastAsia="Calibri" w:cs="Calibri"/>
+        </w:rPr>
+        <w:t xml:space="preserve">78. 1. Zmiana warunków</w:t>
+      </w:r>
+    </w:p>
+    <w:p>
+      <w:pPr>
         <w:pStyle w:val="Normal"/>
         <w:keepNext w:val="false"/>
         <w:spacing w:lineRule="exact" w:line="300" w:before="0" w:after="160"/>
@@ -2287,6 +3236,20 @@
     </w:p>
     <w:p>
       <w:pPr>
+        <w:pStyle w:val="Heading1"/>
+        <w:keepNext w:val="true"/>
+        <w:spacing w:before="360" w:after="80"/>
+        <w:rPr/>
+      </w:pPr>
+      <w:r>
+        <w:rPr>
+          <w:rFonts w:eastAsia="Calibri" w:cs="Calibri"/>
+        </w:rPr>
+        <w:t xml:space="preserve">79. 2. Cienkie rzeczy znikają przy zmniejszaniu</w:t>
+      </w:r>
+    </w:p>
+    <w:p>
+      <w:pPr>
         <w:pStyle w:val="Normal"/>
         <w:keepNext w:val="false"/>
         <w:spacing w:lineRule="exact" w:line="300" w:before="0" w:after="160"/>
@@ -2306,6 +3269,20 @@
     </w:p>
     <w:p>
       <w:pPr>
+        <w:pStyle w:val="Heading1"/>
+        <w:keepNext w:val="true"/>
+        <w:spacing w:before="360" w:after="80"/>
+        <w:rPr/>
+      </w:pPr>
+      <w:r>
+        <w:rPr>
+          <w:rFonts w:eastAsia="Calibri" w:cs="Calibri"/>
+        </w:rPr>
+        <w:t xml:space="preserve">80. 3. Szybkość: dokładność kontra czas</w:t>
+      </w:r>
+    </w:p>
+    <w:p>
+      <w:pPr>
         <w:pStyle w:val="Normal"/>
         <w:keepNext w:val="false"/>
         <w:spacing w:lineRule="exact" w:line="300" w:before="0" w:after="160"/>
@@ -2325,6 +3302,20 @@
     </w:p>
     <w:p>
       <w:pPr>
+        <w:pStyle w:val="Heading1"/>
+        <w:keepNext w:val="true"/>
+        <w:spacing w:before="360" w:after="80"/>
+        <w:rPr/>
+      </w:pPr>
+      <w:r>
+        <w:rPr>
+          <w:rFonts w:eastAsia="Calibri" w:cs="Calibri"/>
+        </w:rPr>
+        <w:t xml:space="preserve">81. 4. Koszt danych: uczenie z tańszych wskazówek</w:t>
+      </w:r>
+    </w:p>
+    <w:p>
+      <w:pPr>
         <w:pStyle w:val="Normal"/>
         <w:keepNext w:val="false"/>
         <w:spacing w:lineRule="exact" w:line="300" w:before="0" w:after="160"/>
@@ -2344,6 +3335,20 @@
     </w:p>
     <w:p>
       <w:pPr>
+        <w:pStyle w:val="Heading1"/>
+        <w:keepNext w:val="true"/>
+        <w:spacing w:before="360" w:after="80"/>
+        <w:rPr/>
+      </w:pPr>
+      <w:r>
+        <w:rPr>
+          <w:rFonts w:eastAsia="Calibri" w:cs="Calibri"/>
+        </w:rPr>
+        <w:t xml:space="preserve">82. 5. Sprawiedliwość: kogo próg w ogóle zauważy</w:t>
+      </w:r>
+    </w:p>
+    <w:p>
+      <w:pPr>
         <w:pStyle w:val="Normal"/>
         <w:keepNext w:val="false"/>
         <w:spacing w:lineRule="exact" w:line="300" w:before="0" w:after="160"/>
@@ -2372,7 +3377,7 @@
         <w:rPr>
           <w:rFonts w:eastAsia="Calibri" w:cs="Calibri"/>
         </w:rPr>
-        <w:t>18. Ile razy dzisiaj dotknęła was segmentacja?</w:t>
+        <w:t xml:space="preserve">83. Tryb portretowy i tło w wideorozmowie</w:t>
       </w:r>
     </w:p>
     <w:p>
@@ -2429,7 +3434,54 @@
           <w:sz w:val="24"/>
           <w:szCs w:val="24"/>
         </w:rPr>
-        <w:t>Tryb portretowy w telefonie: telefon wycina osobę i rozmywa wszystko za nią. Rozmyte albo podmienione tło w wideorozmowie: to samo, tylko kilkadziesiąt razy na sekundę, często modelem bardzo podobnym do tego z trybu drugiego. Filtry z wirtualnymi okularami: aplikacja musi wiedzieć, gdzie dokładnie są oczy, żeby okulary nie wylądowały na czole.</w:t>
+        <w:t xml:space="preserve">Tryb portretowy w telefonie: telefon wycina osobę i rozmywa wszystko za nią. Rozmyte albo podmienione tło w wideorozmowie: to samo, tylko kilkadziesiąt razy na sekundę, często modelem bardzo podobnym do tego z trybu drugiego.</w:t>
+      </w:r>
+    </w:p>
+    <w:p>
+      <w:pPr>
+        <w:pStyle w:val="Heading1"/>
+        <w:keepNext w:val="true"/>
+        <w:spacing w:before="360" w:after="80"/>
+        <w:rPr/>
+      </w:pPr>
+      <w:r>
+        <w:rPr>
+          <w:rFonts w:eastAsia="Calibri" w:cs="Calibri"/>
+        </w:rPr>
+        <w:t xml:space="preserve">84. Filtr z wirtualnymi okularami</w:t>
+      </w:r>
+    </w:p>
+    <w:p>
+      <w:pPr>
+        <w:pStyle w:val="Normal"/>
+        <w:keepNext w:val="false"/>
+        <w:spacing w:lineRule="exact" w:line="300" w:before="0" w:after="160"/>
+        <w:rPr/>
+      </w:pPr>
+      <w:r>
+        <w:rPr>
+          <w:rFonts w:eastAsia="Calibri" w:cs="Calibri"/>
+          <w:i w:val="false"/>
+          <w:iCs w:val="false"/>
+          <w:color w:val="1E2024"/>
+          <w:sz w:val="24"/>
+          <w:szCs w:val="24"/>
+        </w:rPr>
+        <w:t xml:space="preserve">Filtry z wirtualnymi okularami: aplikacja musi wiedzieć, gdzie dokładnie są oczy, żeby okulary nie wylądowały na czole.</w:t>
+      </w:r>
+    </w:p>
+    <w:p>
+      <w:pPr>
+        <w:pStyle w:val="Heading1"/>
+        <w:keepNext w:val="true"/>
+        <w:spacing w:before="360" w:after="80"/>
+        <w:rPr/>
+      </w:pPr>
+      <w:r>
+        <w:rPr>
+          <w:rFonts w:eastAsia="Calibri" w:cs="Calibri"/>
+        </w:rPr>
+        <w:t xml:space="preserve">85. Samochód, lekarz, mapa</w:t>
       </w:r>
     </w:p>
     <w:p>
@@ -2453,6 +3505,20 @@
     </w:p>
     <w:p>
       <w:pPr>
+        <w:pStyle w:val="Heading1"/>
+        <w:keepNext w:val="true"/>
+        <w:spacing w:before="360" w:after="80"/>
+        <w:rPr/>
+      </w:pPr>
+      <w:r>
+        <w:rPr>
+          <w:rFonts w:eastAsia="Calibri" w:cs="Calibri"/>
+        </w:rPr>
+        <w:t xml:space="preserve">86. Nie każda pomyłka jest równie groźna</w:t>
+      </w:r>
+    </w:p>
+    <w:p>
+      <w:pPr>
         <w:pStyle w:val="Normal"/>
         <w:keepNext w:val="false"/>
         <w:spacing w:lineRule="exact" w:line="300" w:before="0" w:after="160"/>
@@ -2481,7 +3547,7 @@
         <w:rPr>
           <w:rFonts w:eastAsia="Calibri" w:cs="Calibri"/>
         </w:rPr>
-        <w:t>19. Ten sam obraz. Inna odpowiedź.</w:t>
+        <w:t xml:space="preserve">87. Ten sam obraz. Inna odpowiedź.</w:t>
       </w:r>
     </w:p>
     <w:p>
@@ -2524,6 +3590,20 @@
     </w:p>
     <w:p>
       <w:pPr>
+        <w:pStyle w:val="Heading1"/>
+        <w:keepNext w:val="true"/>
+        <w:spacing w:before="360" w:after="80"/>
+        <w:rPr/>
+      </w:pPr>
+      <w:r>
+        <w:rPr>
+          <w:rFonts w:eastAsia="Calibri" w:cs="Calibri"/>
+        </w:rPr>
+        <w:t xml:space="preserve">88. Każdy system podejmuje taką decyzję</w:t>
+      </w:r>
+    </w:p>
+    <w:p>
+      <w:pPr>
         <w:pStyle w:val="Normal"/>
         <w:keepNext w:val="false"/>
         <w:spacing w:lineRule="exact" w:line="300" w:before="0" w:after="160"/>
@@ -2543,6 +3623,20 @@
     </w:p>
     <w:p>
       <w:pPr>
+        <w:pStyle w:val="Heading1"/>
+        <w:keepNext w:val="true"/>
+        <w:spacing w:before="360" w:after="80"/>
+        <w:rPr/>
+      </w:pPr>
+      <w:r>
+        <w:rPr>
+          <w:rFonts w:eastAsia="Calibri" w:cs="Calibri"/>
+        </w:rPr>
+        <w:t xml:space="preserve">89. Dziś widzieliście cztery takie decyzje</w:t>
+      </w:r>
+    </w:p>
+    <w:p>
+      <w:pPr>
         <w:pStyle w:val="Normal"/>
         <w:keepNext w:val="false"/>
         <w:spacing w:lineRule="exact" w:line="300" w:before="0" w:after="160"/>
@@ -2590,7 +3684,7 @@
         <w:rPr>
           <w:rFonts w:eastAsia="Calibri" w:cs="Calibri"/>
         </w:rPr>
-        <w:t>20. Który piksel nauczycie znaczenia?</w:t>
+        <w:t xml:space="preserve">90. Który piksel nauczycie znaczenia?</w:t>
       </w:r>
     </w:p>
     <w:p>

</xml_diff>

<commit_message>
Aktywne kontury i wododziały: porównanie z poprzednią metodą
Aktywne kontury: kubek na stole w cieniu, gdzie progowanie zawodzi,
a gumka trzyma się krawędzi. Wododziały: trzy stykające się komórki,
które gumka łączy w jeden obiekt, a wododziały rozdzielają; teren
z wodą jest teraz przekrojem przez te komórki. Tekst w docx zaktualizowany.

Co-Authored-By: Claude Opus 5.5 <noreply@anthropic.com>
</commit_message>
<xml_diff>
--- a/tekst_wykladu.docx
+++ b/tekst_wykladu.docx
@@ -211,6 +211,7 @@
         <w:spacing w:before="360" w:after="80"/>
       </w:pPr>
       <w:r>
+        <w:lastRenderedPageBreak/>
         <w:t>7. Ktoś musi zdecydować, co jest obiektem</w:t>
       </w:r>
     </w:p>
@@ -391,7 +392,13 @@
         <w:rPr>
           <w:color w:val="1E2024"/>
         </w:rPr>
-        <w:t>Weźmy jeden obrazek: trzy owce na trawie. Na kolejnych trzech slajdach posegmentujemy go na trzy różne sposoby, a w rogu każdego z nich zostanie mały oryginał do porównania.</w:t>
+        <w:t>Weźmy jeden obrazek: trzy owce na trawie. Na kolejnych trzech slajdach posegmentujemy go na trzy różne sposoby</w:t>
+      </w:r>
+      <w:r>
+        <w:rPr>
+          <w:color w:val="1E2024"/>
+        </w:rPr>
+        <w:t>.</w:t>
       </w:r>
     </w:p>
     <w:p>
@@ -422,6 +429,7 @@
         <w:spacing w:before="360" w:after="80"/>
       </w:pPr>
       <w:r>
+        <w:lastRenderedPageBreak/>
         <w:t>15. 2. Instancyjna: każda owca osobno</w:t>
       </w:r>
     </w:p>
@@ -443,18 +451,40 @@
         <w:spacing w:before="360" w:after="80"/>
       </w:pPr>
       <w:r>
-        <w:t>16. 3. Panoptyczna: wszystko naraz</w:t>
-      </w:r>
-    </w:p>
-    <w:p>
-      <w:pPr>
-        <w:spacing w:after="160" w:line="300" w:lineRule="exact"/>
-      </w:pPr>
-      <w:r>
-        <w:rPr>
-          <w:color w:val="1E2024"/>
-        </w:rPr>
-        <w:t>Trzeci sposób to segmentacja panoptyczna, czyli połączenie dwóch poprzednich: każda owca osobno, tak jak w instancyjnej, a do tego trawa i niebo jako tło, tak jak w semantycznej. Rozróżniamy tu rzeczy, które da się policzyć, jak owce, ludzie czy samochody, oraz takie, których się nie liczy, jak trawa, niebo czy droga.</w:t>
+        <w:t xml:space="preserve">16. 3. </w:t>
+      </w:r>
+      <w:proofErr w:type="spellStart"/>
+      <w:r>
+        <w:t>Panoptyczna</w:t>
+      </w:r>
+      <w:proofErr w:type="spellEnd"/>
+      <w:r>
+        <w:t>: wszystko naraz</w:t>
+      </w:r>
+    </w:p>
+    <w:p>
+      <w:pPr>
+        <w:spacing w:after="160" w:line="300" w:lineRule="exact"/>
+      </w:pPr>
+      <w:r>
+        <w:rPr>
+          <w:color w:val="1E2024"/>
+        </w:rPr>
+        <w:t xml:space="preserve">Trzeci sposób to segmentacja </w:t>
+      </w:r>
+      <w:proofErr w:type="spellStart"/>
+      <w:r>
+        <w:rPr>
+          <w:color w:val="1E2024"/>
+        </w:rPr>
+        <w:t>panoptyczna</w:t>
+      </w:r>
+      <w:proofErr w:type="spellEnd"/>
+      <w:r>
+        <w:rPr>
+          <w:color w:val="1E2024"/>
+        </w:rPr>
+        <w:t>, czyli połączenie dwóch poprzednich: każda owca osobno, tak jak w instancyjnej, a do tego trawa i niebo jako tło, tak jak w semantycznej. Rozróżniamy tu rzeczy, które da się policzyć, jak owce, ludzie czy samochody, oraz takie, których się nie liczy, jak trawa, niebo czy droga.</w:t>
       </w:r>
     </w:p>
     <w:p>
@@ -475,7 +505,21 @@
         <w:rPr>
           <w:color w:val="1E2024"/>
         </w:rPr>
-        <w:t>Który sposób wybrać, zależy od tego, do czego to ma służyć. Rozmycie tła w wideorozmowie? Wystarczy pierwszy: osoba albo tło. Samochód autonomiczny? Potrzebuje trzeciego. Drogę może traktować jako jedną płaszczyznę, ale każdego pieszego musi śledzić osobno, bo każdy idzie w inną stronę.</w:t>
+        <w:t xml:space="preserve">Który sposób wybrać, zależy od tego, do czego to ma służyć. Rozmycie tła w </w:t>
+      </w:r>
+      <w:proofErr w:type="spellStart"/>
+      <w:r>
+        <w:rPr>
+          <w:color w:val="1E2024"/>
+        </w:rPr>
+        <w:t>wideorozmowie</w:t>
+      </w:r>
+      <w:proofErr w:type="spellEnd"/>
+      <w:r>
+        <w:rPr>
+          <w:color w:val="1E2024"/>
+        </w:rPr>
+        <w:t>? Wystarczy pierwszy: osoba albo tło. Samochód autonomiczny? Potrzebuje trzeciego. Drogę może traktować jako jedną płaszczyznę, ale każdego pieszego musi śledzić osobno, bo każdy idzie w inną stronę.</w:t>
       </w:r>
     </w:p>
     <w:p>
@@ -523,7 +567,49 @@
         <w:rPr>
           <w:color w:val="1E2024"/>
         </w:rPr>
-        <w:t>Najpierw metody klasyczne: progowanie, aktywne kontury, wododziały i GrabCut. W nich to człowiek wymyśla regułę, według której komputer dzieli obraz. Potem sieci neuronowe, które tej reguły uczą się same, z przykładów: od pierwszych prób w 2012 roku, przez FCN, U-Net i DeepLab, Mask R-CNN i transformery, aż po model SAM z 2023 roku.</w:t>
+        <w:t xml:space="preserve">Najpierw metody klasyczne: progowanie, aktywne kontury, wododziały i </w:t>
+      </w:r>
+      <w:proofErr w:type="spellStart"/>
+      <w:r>
+        <w:rPr>
+          <w:color w:val="1E2024"/>
+        </w:rPr>
+        <w:t>GrabCut</w:t>
+      </w:r>
+      <w:proofErr w:type="spellEnd"/>
+      <w:r>
+        <w:rPr>
+          <w:color w:val="1E2024"/>
+        </w:rPr>
+        <w:t xml:space="preserve">. W nich to człowiek wymyśla regułę, według której komputer dzieli obraz. Potem sieci neuronowe, które tej reguły uczą się same, z przykładów: od pierwszych prób w 2012 roku, przez FCN, U-Net i </w:t>
+      </w:r>
+      <w:proofErr w:type="spellStart"/>
+      <w:r>
+        <w:rPr>
+          <w:color w:val="1E2024"/>
+        </w:rPr>
+        <w:t>DeepLab</w:t>
+      </w:r>
+      <w:proofErr w:type="spellEnd"/>
+      <w:r>
+        <w:rPr>
+          <w:color w:val="1E2024"/>
+        </w:rPr>
+        <w:t xml:space="preserve">, </w:t>
+      </w:r>
+      <w:proofErr w:type="spellStart"/>
+      <w:r>
+        <w:rPr>
+          <w:color w:val="1E2024"/>
+        </w:rPr>
+        <w:t>Mask</w:t>
+      </w:r>
+      <w:proofErr w:type="spellEnd"/>
+      <w:r>
+        <w:rPr>
+          <w:color w:val="1E2024"/>
+        </w:rPr>
+        <w:t xml:space="preserve"> R-CNN i transformery, aż po model SAM z 2023 roku.</w:t>
       </w:r>
     </w:p>
     <w:p>
@@ -586,6 +672,7 @@
         <w:spacing w:before="360" w:after="80"/>
       </w:pPr>
       <w:r>
+        <w:lastRenderedPageBreak/>
         <w:t>21. Gorzej, gdy świat jest bardziej skomplikowany</w:t>
       </w:r>
     </w:p>
@@ -607,39 +694,105 @@
         <w:spacing w:before="360" w:after="80"/>
       </w:pPr>
       <w:r>
-        <w:t>22. Aktywne kontury: gumka recepturka</w:t>
-      </w:r>
-    </w:p>
-    <w:p>
-      <w:pPr>
-        <w:spacing w:after="160" w:line="300" w:lineRule="exact"/>
-      </w:pPr>
-      <w:r>
-        <w:rPr>
-          <w:color w:val="1E2024"/>
-        </w:rPr>
-        <w:t>Przełom lat osiemdziesiątych i dziewięćdziesiątych: aktywne kontury. Wyobraźcie sobie gumkę recepturkę, którą rzucamy wokół obiektu i która sama zaciska się na jego krawędziach. W komputerze ta gumka to zamknięta linia z kilkudziesięciu punktów, które krok po kroku przesuwają się do środka. Działają na nie dwie siły: napięcie gumki, które trzyma linię gładką, i przyciąganie krawędzi, czyli miejsc, gdzie jasność gwałtownie się zmienia. Gumka zatrzymuje się tam, gdzie te siły się równoważą, czyli na brzegu obiektu.</w:t>
-      </w:r>
-    </w:p>
-    <w:p>
-      <w:pPr>
-        <w:pStyle w:val="Nagwek1"/>
-        <w:keepNext/>
-        <w:spacing w:before="360" w:after="80"/>
-      </w:pPr>
-      <w:r>
-        <w:t>23. Wododziały: obraz jako górzysty teren zalewany wodą</w:t>
-      </w:r>
-    </w:p>
-    <w:p>
-      <w:pPr>
-        <w:spacing w:after="160" w:line="300" w:lineRule="exact"/>
-      </w:pPr>
-      <w:r>
-        <w:rPr>
-          <w:color w:val="1E2024"/>
-        </w:rPr>
-        <w:t>Albo metoda wododziałów: traktujemy obraz jak mapę górzystego terenu, zalewamy ją wodą i patrzymy, gdzie spotykają się jeziora. Jasność piksela to wysokość terenu: jasne piksele to góry, ciemne to doliny. Woda powoli podnosi się w każdej dolinie i każde jezioro to osobny obszar. Tam, gdzie dwa jeziora miałyby się zlać, stawiamy tamę, i właśnie te tamy są granicami obiektów.</w:t>
+        <w:t>22. Aktywne kontury: krawędź zamiast progu</w:t>
+      </w:r>
+    </w:p>
+    <w:p>
+      <w:pPr>
+        <w:spacing w:after="160" w:line="300" w:lineRule="exact"/>
+      </w:pPr>
+      <w:r>
+        <w:rPr>
+          <w:color w:val="1E2024"/>
+        </w:rPr>
+        <w:t>Przełom lat osiemdziesiątych i dziewięćdziesiątych: aktywne kontury. Wyobraźcie sobie gumkę recepturkę, którą rzucamy wokół obiektu i która sama zaciska się na jego krawędziach.</w:t>
+      </w:r>
+    </w:p>
+    <w:p>
+      <w:pPr>
+        <w:spacing w:after="160" w:line="300" w:lineRule="exact"/>
+      </w:pPr>
+      <w:r>
+        <w:rPr>
+          <w:color w:val="1E2024"/>
+        </w:rPr>
+        <w:t>Czym to się różni od progowania? Wróćmy do kubka sprzed dwóch slajdów, ale teraz na stół pada cień, a na kubku jest odblask. Progowanie porównuje każdy piksel z jedną liczbą dla całego obrazu. Tu nie ma dobrego progu: ciemny koniec stołu jest ciemniejszy niż jasny bok kubka. Dlatego kubek zlewa się z cieniem, odblask robi w nim dziurę, a okruchy na stole stają się małymi obiektami.</w:t>
+      </w:r>
+    </w:p>
+    <w:p>
+      <w:pPr>
+        <w:spacing w:after="160" w:line="300" w:lineRule="exact"/>
+      </w:pPr>
+      <w:r>
+        <w:rPr>
+          <w:color w:val="1E2024"/>
+        </w:rPr>
+        <w:t>Gumka nie pyta, czy piksel jest ciemny, tylko gdzie jasność zmienia się w porównaniu z sąsiadami, czyli gdzie jest krawędź. Cień przyciemnia i kubek, i stół tuż obok niego, więc krawędź zostaje. Do tego gumka jest zawsze jedną zamkniętą, gładką linią: nie zrobi dziury w środku kubka i nie rozpadnie się na kawałki, a okruchy daleko od niej w ogóle jej nie obchodzą.</w:t>
+      </w:r>
+    </w:p>
+    <w:p>
+      <w:pPr>
+        <w:spacing w:after="160" w:line="300" w:lineRule="exact"/>
+      </w:pPr>
+      <w:r>
+        <w:rPr>
+          <w:color w:val="1E2024"/>
+        </w:rPr>
+        <w:t>Cena jest taka, że ktoś musi tę gumkę najpierw rzucić w pobliżu obiektu. Progowanie działało samo.</w:t>
+      </w:r>
+    </w:p>
+    <w:p>
+      <w:pPr>
+        <w:pStyle w:val="Nagwek1"/>
+        <w:keepNext/>
+        <w:spacing w:before="360" w:after="80"/>
+      </w:pPr>
+      <w:r>
+        <w:t>23. Wododziały: same rozdzielają stykające się obiekty</w:t>
+      </w:r>
+    </w:p>
+    <w:p>
+      <w:pPr>
+        <w:spacing w:after="160" w:line="300" w:lineRule="exact"/>
+      </w:pPr>
+      <w:r>
+        <w:rPr>
+          <w:color w:val="1E2024"/>
+        </w:rPr>
+        <w:t>Albo metoda wododziałów: traktujemy obraz jak mapę górzystego terenu, zalewamy ją wodą i patrzymy, gdzie spotykają się jeziora.</w:t>
+      </w:r>
+    </w:p>
+    <w:p>
+      <w:pPr>
+        <w:spacing w:after="160" w:line="300" w:lineRule="exact"/>
+      </w:pPr>
+      <w:r>
+        <w:rPr>
+          <w:color w:val="1E2024"/>
+        </w:rPr>
+        <w:t>Czym to się różni od gumki? Weźmy trzy komórki z mikroskopu, które się ze sobą stykają. Gumka to zawsze jedna zamknięta linia. Rzucona wokół nich zaciśnie się na zewnętrznym brzegu całej grupy i powie, że to jeden obiekt. Żeby je rozdzielić, ktoś musiałby rzucić trzy gumki, każdą osobno.</w:t>
+      </w:r>
+    </w:p>
+    <w:p>
+      <w:pPr>
+        <w:spacing w:after="160" w:line="300" w:lineRule="exact"/>
+      </w:pPr>
+      <w:r>
+        <w:rPr>
+          <w:color w:val="1E2024"/>
+        </w:rPr>
+        <w:t>Wododziały robią to same i od razu dla całego obrazu. Po lewej widać przekrój wzdłuż przerywanej linii. Jasność to wysokość, więc ciemne wnętrza komórek to doliny, jasne tło to góry, a cienkie, jaśniejsze ścianki między komórkami to grzbiety. Woda podnosi się w każdej dolinie osobno. Tam, gdzie dwa jeziora miałyby się zlać, stawiamy tamę, i te tamy to właśnie granice. Wychodzą trzy jeziora, czyli trzy komórki, i to nawet wtedy, gdy grzbiet między nimi jest niski.</w:t>
+      </w:r>
+    </w:p>
+    <w:p>
+      <w:pPr>
+        <w:spacing w:after="160" w:line="300" w:lineRule="exact"/>
+      </w:pPr>
+      <w:r>
+        <w:rPr>
+          <w:color w:val="1E2024"/>
+        </w:rPr>
+        <w:t>Dlatego wododziały do dziś pomagają liczyć komórki na zdjęciach z mikroskopu. Ich słabość to szum: każda drobna dolinka tworzy własne jezioro, więc bez wcześniejszego wygładzenia obraz rozpada się na setki kawałków.</w:t>
       </w:r>
     </w:p>
     <w:p>
@@ -660,7 +813,21 @@
         <w:rPr>
           <w:color w:val="1E2024"/>
         </w:rPr>
-        <w:t>Lata dwutysięczne: komputer zaczyna patrzeć na cały obraz naraz i szuka takiego podziału, w którym podobne sąsiednie piksele trafiają do tej samej grupy. Na slajdzie każda kropka to piksel, a sąsiednie kropki łączą nitki: grube, gdy piksele mają podobny kolor, i cienkie, gdy różny. Algorytm szuka cięcia, które oddzieli obiekt od tła, przecinając jak najmniej i jak najcieńsze nitki, więc granica sama wypada tam, gdzie zmienia się kolor. Na tym działa GrabCut z 2004 roku, który za chwilę zobaczycie na żywo. Wystarczy w nim z grubsza zaznaczyć obiekt prostokątem, a resztę komputer policzy sam.</w:t>
+        <w:t xml:space="preserve">Lata dwutysięczne: komputer zaczyna patrzeć na cały obraz naraz i szuka takiego podziału, w którym podobne sąsiednie piksele trafiają do tej samej grupy. Na slajdzie każda kropka to piksel, a sąsiednie kropki łączą nitki: grube, gdy piksele mają podobny kolor, i cienkie, gdy różny. Algorytm szuka cięcia, które oddzieli obiekt od tła, przecinając jak najmniej i jak najcieńsze nitki, więc granica sama wypada tam, gdzie zmienia się kolor. Na tym działa </w:t>
+      </w:r>
+      <w:proofErr w:type="spellStart"/>
+      <w:r>
+        <w:rPr>
+          <w:color w:val="1E2024"/>
+        </w:rPr>
+        <w:t>GrabCut</w:t>
+      </w:r>
+      <w:proofErr w:type="spellEnd"/>
+      <w:r>
+        <w:rPr>
+          <w:color w:val="1E2024"/>
+        </w:rPr>
+        <w:t xml:space="preserve"> z 2004 roku, który za chwilę zobaczycie na żywo. Wystarczy w nim z grubsza zaznaczyć obiekt prostokątem, a resztę komputer policzy sam.</w:t>
       </w:r>
     </w:p>
     <w:p>
@@ -712,6 +879,7 @@
         <w:spacing w:before="360" w:after="80"/>
       </w:pPr>
       <w:r>
+        <w:lastRenderedPageBreak/>
         <w:t>27. FCN: odpowiedź dla każdego fragmentu obrazu</w:t>
       </w:r>
     </w:p>
@@ -739,7 +907,21 @@
         <w:rPr>
           <w:color w:val="1E2024"/>
         </w:rPr>
-        <w:t>W 2015 roku trzech badaczy z Berkeley zauważyło coś prostego. Istniały już sieci neuronowe, które świetnie rozpoznawały, co jest na zdjęciu, ale na końcu ściskały całą swoją wiedzę w jedną odpowiedź, na przykład „kot”. Wystarczyło przebudować końcówkę sieci tak, żeby zamiast jednej odpowiedzi dawała odpowiedź dla każdego fragmentu obrazu. Tak powstały sieci w pełni konwolucyjne, w skrócie FCN.</w:t>
+        <w:t xml:space="preserve">W 2015 roku trzech badaczy z Berkeley zauważyło coś prostego. Istniały już sieci neuronowe, które świetnie rozpoznawały, co jest na zdjęciu, ale na końcu ściskały całą swoją wiedzę w jedną odpowiedź, na przykład „kot”. Wystarczyło przebudować końcówkę sieci tak, żeby zamiast jednej odpowiedzi dawała odpowiedź dla każdego fragmentu obrazu. Tak powstały sieci w pełni </w:t>
+      </w:r>
+      <w:proofErr w:type="spellStart"/>
+      <w:r>
+        <w:rPr>
+          <w:color w:val="1E2024"/>
+        </w:rPr>
+        <w:t>konwolucyjne</w:t>
+      </w:r>
+      <w:proofErr w:type="spellEnd"/>
+      <w:r>
+        <w:rPr>
+          <w:color w:val="1E2024"/>
+        </w:rPr>
+        <w:t>, w skrócie FCN.</w:t>
       </w:r>
     </w:p>
     <w:p>
@@ -902,6 +1084,7 @@
         <w:spacing w:before="360" w:after="80"/>
       </w:pPr>
       <w:r>
+        <w:lastRenderedPageBreak/>
         <w:t>34. Skróty przenoszą szczegóły prosto na drugą stronę</w:t>
       </w:r>
     </w:p>
@@ -955,7 +1138,35 @@
         <w:rPr>
           <w:color w:val="1E2024"/>
         </w:rPr>
-        <w:t>Dziś U-Net jest standardem w medycynie, a jego odmiana działa nawet w generatorach obrazów, takich jak Stable Diffusion.</w:t>
+        <w:t xml:space="preserve">Dziś U-Net jest standardem w medycynie, a jego odmiana działa nawet w generatorach obrazów, takich jak </w:t>
+      </w:r>
+      <w:proofErr w:type="spellStart"/>
+      <w:r>
+        <w:rPr>
+          <w:color w:val="1E2024"/>
+        </w:rPr>
+        <w:t>Stable</w:t>
+      </w:r>
+      <w:proofErr w:type="spellEnd"/>
+      <w:r>
+        <w:rPr>
+          <w:color w:val="1E2024"/>
+        </w:rPr>
+        <w:t xml:space="preserve"> </w:t>
+      </w:r>
+      <w:proofErr w:type="spellStart"/>
+      <w:r>
+        <w:rPr>
+          <w:color w:val="1E2024"/>
+        </w:rPr>
+        <w:t>Diffusion</w:t>
+      </w:r>
+      <w:proofErr w:type="spellEnd"/>
+      <w:r>
+        <w:rPr>
+          <w:color w:val="1E2024"/>
+        </w:rPr>
+        <w:t>.</w:t>
       </w:r>
     </w:p>
     <w:p>
@@ -1065,27 +1276,50 @@
         <w:spacing w:before="360" w:after="80"/>
       </w:pPr>
       <w:r>
-        <w:t>41. Później DeepLab dostał część podobną do U-Netu</w:t>
-      </w:r>
-    </w:p>
-    <w:p>
-      <w:pPr>
-        <w:spacing w:after="160" w:line="300" w:lineRule="exact"/>
-      </w:pPr>
-      <w:r>
-        <w:rPr>
-          <w:color w:val="1E2024"/>
-        </w:rPr>
-        <w:t>Ciekawe, że w późniejszych wersjach DeepLab dostał też część podobną do U-Netu. Różne pomysły zaczynają się ze sobą łączyć.</w:t>
-      </w:r>
-    </w:p>
-    <w:p>
-      <w:pPr>
-        <w:pStyle w:val="Nagwek1"/>
-        <w:keepNext/>
-        <w:spacing w:before="360" w:after="80"/>
-      </w:pPr>
-      <w:r>
+        <w:t xml:space="preserve">41. Później </w:t>
+      </w:r>
+      <w:proofErr w:type="spellStart"/>
+      <w:r>
+        <w:t>DeepLab</w:t>
+      </w:r>
+      <w:proofErr w:type="spellEnd"/>
+      <w:r>
+        <w:t xml:space="preserve"> dostał część podobną do U-Netu</w:t>
+      </w:r>
+    </w:p>
+    <w:p>
+      <w:pPr>
+        <w:spacing w:after="160" w:line="300" w:lineRule="exact"/>
+      </w:pPr>
+      <w:r>
+        <w:rPr>
+          <w:color w:val="1E2024"/>
+        </w:rPr>
+        <w:t xml:space="preserve">Ciekawe, że w późniejszych wersjach </w:t>
+      </w:r>
+      <w:proofErr w:type="spellStart"/>
+      <w:r>
+        <w:rPr>
+          <w:color w:val="1E2024"/>
+        </w:rPr>
+        <w:t>DeepLab</w:t>
+      </w:r>
+      <w:proofErr w:type="spellEnd"/>
+      <w:r>
+        <w:rPr>
+          <w:color w:val="1E2024"/>
+        </w:rPr>
+        <w:t xml:space="preserve"> dostał też część podobną do U-Netu. Różne pomysły zaczynają się ze sobą łączyć.</w:t>
+      </w:r>
+    </w:p>
+    <w:p>
+      <w:pPr>
+        <w:pStyle w:val="Nagwek1"/>
+        <w:keepNext/>
+        <w:spacing w:before="360" w:after="80"/>
+      </w:pPr>
+      <w:r>
+        <w:lastRenderedPageBreak/>
         <w:t>42. Wróćmy do owiec: do której należy ten piksel?</w:t>
       </w:r>
     </w:p>
@@ -1113,7 +1347,21 @@
         <w:rPr>
           <w:color w:val="1E2024"/>
         </w:rPr>
-        <w:t>Wróćmy do owiec. Do tej pory pytaliśmy, jakiego rodzaju jest piksel. Mask R-CNN z 2017 roku, z laboratorium Facebooka, odpowiada na pytanie, do której konkretnie owcy należy.</w:t>
+        <w:t xml:space="preserve">Wróćmy do owiec. Do tej pory pytaliśmy, jakiego rodzaju jest piksel. </w:t>
+      </w:r>
+      <w:proofErr w:type="spellStart"/>
+      <w:r>
+        <w:rPr>
+          <w:color w:val="1E2024"/>
+        </w:rPr>
+        <w:t>Mask</w:t>
+      </w:r>
+      <w:proofErr w:type="spellEnd"/>
+      <w:r>
+        <w:rPr>
+          <w:color w:val="1E2024"/>
+        </w:rPr>
+        <w:t xml:space="preserve"> R-CNN z 2017 roku, z laboratorium Facebooka, odpowiada na pytanie, do której konkretnie owcy należy.</w:t>
       </w:r>
     </w:p>
     <w:p>
@@ -1213,18 +1461,46 @@
         <w:rPr>
           <w:color w:val="1E2024"/>
         </w:rPr>
-        <w:t>Około 2020 roku do segmentacji trafiają transformery, czyli ta sama rodzina modeli, na której działa ChatGPT.</w:t>
-      </w:r>
-    </w:p>
-    <w:p>
-      <w:pPr>
-        <w:spacing w:after="160" w:line="300" w:lineRule="exact"/>
-      </w:pPr>
-      <w:r>
-        <w:rPr>
-          <w:color w:val="1E2024"/>
-        </w:rPr>
-        <w:t>Najciekawsza zmiana polega na odwróceniu pytania. Do tej pory model szedł od piksela do piksela i pytał: co to jest? Nowe modele, takie jak MaskFormer i Mask2Former, robią to inaczej. Mają z góry ustaloną liczbę pustych szuflad, powiedzmy sto. Każda szuflada ma znaleźć na obrazie jedną rzecz i oddać dwie informacje: jaki ta rzecz ma kształt i czym jest.</w:t>
+        <w:t xml:space="preserve">Około 2020 roku do segmentacji trafiają transformery, czyli ta sama rodzina modeli, na której działa </w:t>
+      </w:r>
+      <w:proofErr w:type="spellStart"/>
+      <w:r>
+        <w:rPr>
+          <w:color w:val="1E2024"/>
+        </w:rPr>
+        <w:t>ChatGPT</w:t>
+      </w:r>
+      <w:proofErr w:type="spellEnd"/>
+      <w:r>
+        <w:rPr>
+          <w:color w:val="1E2024"/>
+        </w:rPr>
+        <w:t>.</w:t>
+      </w:r>
+    </w:p>
+    <w:p>
+      <w:pPr>
+        <w:spacing w:after="160" w:line="300" w:lineRule="exact"/>
+      </w:pPr>
+      <w:r>
+        <w:rPr>
+          <w:color w:val="1E2024"/>
+        </w:rPr>
+        <w:t xml:space="preserve">Najciekawsza zmiana polega na odwróceniu pytania. Do tej pory model szedł od piksela do piksela i pytał: co to jest? Nowe modele, takie jak </w:t>
+      </w:r>
+      <w:proofErr w:type="spellStart"/>
+      <w:r>
+        <w:rPr>
+          <w:color w:val="1E2024"/>
+        </w:rPr>
+        <w:t>MaskFormer</w:t>
+      </w:r>
+      <w:proofErr w:type="spellEnd"/>
+      <w:r>
+        <w:rPr>
+          <w:color w:val="1E2024"/>
+        </w:rPr>
+        <w:t xml:space="preserve"> i Mask2Former, robią to inaczej. Mają z góry ustaloną liczbę pustych szuflad, powiedzmy sto. Każda szuflada ma znaleźć na obrazie jedną rzecz i oddać dwie informacje: jaki ta rzecz ma kształt i czym jest.</w:t>
       </w:r>
     </w:p>
     <w:p>
@@ -1266,6 +1542,7 @@
         <w:spacing w:before="360" w:after="80"/>
       </w:pPr>
       <w:r>
+        <w:lastRenderedPageBreak/>
         <w:t>48. Trzy rodzaje segmentacji = jeden model, inaczej odczytany</w:t>
       </w:r>
     </w:p>
@@ -1277,7 +1554,21 @@
         <w:rPr>
           <w:color w:val="1E2024"/>
         </w:rPr>
-        <w:t>Dlaczego to takie wygodne? Bo nagle te trzy rodzaje segmentacji z owcami stają się jednym zadaniem. Jedna szuflada na każdy rodzaj rzeczy to segmentacja semantyczna. Jedna szuflada na każdą owcę to instancyjna. Obie naraz to panoptyczna. Ten sam model, tylko inaczej odczytany wynik.</w:t>
+        <w:t xml:space="preserve">Dlaczego to takie wygodne? Bo nagle te trzy rodzaje segmentacji z owcami stają się jednym zadaniem. Jedna szuflada na każdy rodzaj rzeczy to segmentacja semantyczna. Jedna szuflada na każdą owcę to instancyjna. Obie naraz to </w:t>
+      </w:r>
+      <w:proofErr w:type="spellStart"/>
+      <w:r>
+        <w:rPr>
+          <w:color w:val="1E2024"/>
+        </w:rPr>
+        <w:t>panoptyczna</w:t>
+      </w:r>
+      <w:proofErr w:type="spellEnd"/>
+      <w:r>
+        <w:rPr>
+          <w:color w:val="1E2024"/>
+        </w:rPr>
+        <w:t>. Ten sam model, tylko inaczej odczytany wynik.</w:t>
       </w:r>
     </w:p>
     <w:p>
@@ -1325,7 +1616,21 @@
         <w:rPr>
           <w:color w:val="1E2024"/>
         </w:rPr>
-        <w:t>I ostatni etap tej historii: Segment Anything, model firmy Meta z 2023 roku.</w:t>
+        <w:t xml:space="preserve">I ostatni etap tej historii: Segment </w:t>
+      </w:r>
+      <w:proofErr w:type="spellStart"/>
+      <w:r>
+        <w:rPr>
+          <w:color w:val="1E2024"/>
+        </w:rPr>
+        <w:t>Anything</w:t>
+      </w:r>
+      <w:proofErr w:type="spellEnd"/>
+      <w:r>
+        <w:rPr>
+          <w:color w:val="1E2024"/>
+        </w:rPr>
+        <w:t>, model firmy Meta z 2023 roku.</w:t>
       </w:r>
     </w:p>
     <w:p>
@@ -1452,6 +1757,7 @@
         <w:spacing w:before="360" w:after="80"/>
       </w:pPr>
       <w:r>
+        <w:lastRenderedPageBreak/>
         <w:t>54. Czas na żywą kamerę</w:t>
       </w:r>
     </w:p>
@@ -1483,108 +1789,9 @@
           <w:sz w:val="22"/>
           <w:szCs w:val="22"/>
         </w:rPr>
-        <w:t>[Uruchom: uv run live_demo/gui_launcher.py. Tryby przełączasz klawiszami 1-4. Poproś ochotnika, najlepiej w okularach.]</w:t>
-      </w:r>
-    </w:p>
-    <w:p>
-      <w:pPr>
-        <w:spacing w:after="160" w:line="300" w:lineRule="exact"/>
-      </w:pPr>
-      <w:r>
-        <w:rPr>
-          <w:color w:val="1E2024"/>
-        </w:rPr>
-        <w:t>Zobaczycie teraz trzy podejścia z naszej historii, działające na żywo na zwykłym laptopie, bez żadnej specjalnej karty graficznej.</w:t>
-      </w:r>
-    </w:p>
-    <w:p>
-      <w:pPr>
-        <w:pStyle w:val="Nagwek1"/>
-        <w:keepNext/>
-        <w:spacing w:before="360" w:after="80"/>
-      </w:pPr>
-      <w:r>
-        <w:t>55. Tryb 1: klasyczny — zna tylko kolor</w:t>
-      </w:r>
-    </w:p>
-    <w:p>
-      <w:pPr>
-        <w:spacing w:after="160" w:line="300" w:lineRule="exact"/>
-      </w:pPr>
-      <w:r>
-        <w:rPr>
-          <w:color w:val="1E2024"/>
-        </w:rPr>
-        <w:t>Tryb pierwszy, klasyczny. To metoda z najstarszego etapu historii: komputer szuka pikseli w kolorze skóry, a GrabCut wygładza wynik. Na pomarańczowo jest to, co uznał za skórę. Zwróćcie uwagę na dłoń: też jest pomarańczowa. A jeśli w tle stoi drewniany stół albo jest beżowa ściana, one też się pomalują. Ten algorytm nie ma pojęcia, czym jest twarz. Zna tylko kolor. Okulary dla niego po prostu nie istnieją.</w:t>
-      </w:r>
-    </w:p>
-    <w:p>
-      <w:pPr>
-        <w:pStyle w:val="Nagwek1"/>
-        <w:keepNext/>
-        <w:spacing w:before="360" w:after="80"/>
-      </w:pPr>
-      <w:r>
-        <w:t>56. Tryb 2: sieć od Google — rozumie, co widzi</w:t>
-      </w:r>
-    </w:p>
-    <w:p>
-      <w:pPr>
-        <w:spacing w:after="160" w:line="300" w:lineRule="exact"/>
-      </w:pPr>
-      <w:r>
-        <w:rPr>
-          <w:color w:val="1E2024"/>
-        </w:rPr>
-        <w:t>Tryb drugi, sieć neuronowa od Google. Ona już rozumie, co widzi: osobno tło, włosy, skórę twarzy, skórę rąk i ubranie. Zobaczcie, jak ładnie oddziela włosy od twarzy. Ale okulary? Nie ma dla nich osobnej kategorii, więc w najlepszym razie trafiają do szuflady „inne”. Model nie zauważy czegoś, czego nikt go nie nauczył.</w:t>
-      </w:r>
-    </w:p>
-    <w:p>
-      <w:pPr>
-        <w:pStyle w:val="Nagwek1"/>
-        <w:keepNext/>
-        <w:spacing w:before="360" w:after="80"/>
-      </w:pPr>
-      <w:r>
-        <w:t>57. Tryb 3: 19 części twarzy, w tym okulary</w:t>
-      </w:r>
-    </w:p>
-    <w:p>
-      <w:pPr>
-        <w:spacing w:after="160" w:line="300" w:lineRule="exact"/>
-      </w:pPr>
-      <w:r>
-        <w:rPr>
-          <w:color w:val="1E2024"/>
-        </w:rPr>
-        <w:t>Tryb trzeci, model, który zna 19 części twarzy: brwi, oczy, usta, uszy, włosy i okulary. Poproszę, żeby ochotnik zdjął okulary. Napis: brak okularów. A teraz je zakłada. Napis: okulary wykryte, a oprawka obrysowana na turkusowo. Nic tu nie jest doklejone. Model sam ocenia każdy piksel i stwierdza: to jest oprawka. Sprawdźmy, kiedy się pogubi: obrót głowy, zasłonięcie części twarzy dłonią, odsunięcie się od kamery.</w:t>
-      </w:r>
-    </w:p>
-    <w:p>
-      <w:pPr>
-        <w:pStyle w:val="Nagwek1"/>
-        <w:keepNext/>
-        <w:spacing w:before="360" w:after="80"/>
-      </w:pPr>
-      <w:r>
-        <w:t>58. Tryb 4: wszystkie trzy obok siebie</w:t>
-      </w:r>
-    </w:p>
-    <w:p>
-      <w:pPr>
-        <w:spacing w:after="160" w:line="300" w:lineRule="exact"/>
-      </w:pPr>
-      <w:r>
-        <w:rPr>
-          <w:color w:val="1E2024"/>
-        </w:rPr>
-        <w:t>Tryb czwarty, wszystkie trzy obok siebie. Liczby na dole mówią, ile razy na sekundę każda metoda liczy swój wynik. Przy szybkim ruchu widać, że maski sieci lekko spóźniają się za obrazem. Taka jest cena liczenia na zwykłym procesorze.</w:t>
-      </w:r>
-    </w:p>
-    <w:p>
-      <w:pPr>
-        <w:spacing w:after="160" w:line="300" w:lineRule="exact"/>
-      </w:pPr>
+        <w:t xml:space="preserve">[Uruchom: </w:t>
+      </w:r>
+      <w:proofErr w:type="spellStart"/>
       <w:r>
         <w:rPr>
           <w:i/>
@@ -1593,7 +1800,186 @@
           <w:sz w:val="22"/>
           <w:szCs w:val="22"/>
         </w:rPr>
-        <w:t>[Gdyby kamera nie ruszyła: zmień numer kamery w launcherze. Jeśli dalej nic, opowiedz wyniki na podstawie tabeli z następnego slajdu.]</w:t>
+        <w:t>uv</w:t>
+      </w:r>
+      <w:proofErr w:type="spellEnd"/>
+      <w:r>
+        <w:rPr>
+          <w:i/>
+          <w:iCs/>
+          <w:color w:val="6B7178"/>
+          <w:sz w:val="22"/>
+          <w:szCs w:val="22"/>
+        </w:rPr>
+        <w:t xml:space="preserve"> run </w:t>
+      </w:r>
+      <w:proofErr w:type="spellStart"/>
+      <w:r>
+        <w:rPr>
+          <w:i/>
+          <w:iCs/>
+          <w:color w:val="6B7178"/>
+          <w:sz w:val="22"/>
+          <w:szCs w:val="22"/>
+        </w:rPr>
+        <w:t>live_demo</w:t>
+      </w:r>
+      <w:proofErr w:type="spellEnd"/>
+      <w:r>
+        <w:rPr>
+          <w:i/>
+          <w:iCs/>
+          <w:color w:val="6B7178"/>
+          <w:sz w:val="22"/>
+          <w:szCs w:val="22"/>
+        </w:rPr>
+        <w:t>/gui_launcher.py. Tryby przełączasz klawiszami 1-4. Poproś ochotnika, najlepiej w okularach.]</w:t>
+      </w:r>
+    </w:p>
+    <w:p>
+      <w:pPr>
+        <w:spacing w:after="160" w:line="300" w:lineRule="exact"/>
+      </w:pPr>
+      <w:r>
+        <w:rPr>
+          <w:color w:val="1E2024"/>
+        </w:rPr>
+        <w:t>Zobaczycie teraz trzy podejścia z naszej historii, działające na żywo na zwykłym laptopie, bez żadnej specjalnej karty graficznej.</w:t>
+      </w:r>
+    </w:p>
+    <w:p>
+      <w:pPr>
+        <w:pStyle w:val="Nagwek1"/>
+        <w:keepNext/>
+        <w:spacing w:before="360" w:after="80"/>
+      </w:pPr>
+      <w:r>
+        <w:t>55. Tryb 1: klasyczny — zna tylko kolor</w:t>
+      </w:r>
+    </w:p>
+    <w:p>
+      <w:pPr>
+        <w:spacing w:after="160" w:line="300" w:lineRule="exact"/>
+      </w:pPr>
+      <w:r>
+        <w:rPr>
+          <w:color w:val="1E2024"/>
+        </w:rPr>
+        <w:t xml:space="preserve">Tryb pierwszy, klasyczny. To metoda z najstarszego etapu historii: komputer szuka pikseli w kolorze skóry, a </w:t>
+      </w:r>
+      <w:proofErr w:type="spellStart"/>
+      <w:r>
+        <w:rPr>
+          <w:color w:val="1E2024"/>
+        </w:rPr>
+        <w:t>GrabCut</w:t>
+      </w:r>
+      <w:proofErr w:type="spellEnd"/>
+      <w:r>
+        <w:rPr>
+          <w:color w:val="1E2024"/>
+        </w:rPr>
+        <w:t xml:space="preserve"> wygładza wynik. Na pomarańczowo jest to, co uznał za skórę. Zwróćcie uwagę na dłoń: też jest pomarańczowa. A jeśli w tle stoi drewniany stół albo jest beżowa ściana, one też się pomalują. Ten algorytm nie ma pojęcia, czym jest twarz. Zna tylko kolor. Okulary dla niego po prostu nie istnieją.</w:t>
+      </w:r>
+    </w:p>
+    <w:p>
+      <w:pPr>
+        <w:pStyle w:val="Nagwek1"/>
+        <w:keepNext/>
+        <w:spacing w:before="360" w:after="80"/>
+      </w:pPr>
+      <w:r>
+        <w:t>56. Tryb 2: sieć od Google — rozumie, co widzi</w:t>
+      </w:r>
+    </w:p>
+    <w:p>
+      <w:pPr>
+        <w:spacing w:after="160" w:line="300" w:lineRule="exact"/>
+      </w:pPr>
+      <w:r>
+        <w:rPr>
+          <w:color w:val="1E2024"/>
+        </w:rPr>
+        <w:t>Tryb drugi, sieć neuronowa od Google. Ona już rozumie, co widzi: osobno tło, włosy, skórę twarzy, skórę rąk i ubranie. Zobaczcie, jak ładnie oddziela włosy od twarzy. Ale okulary? Nie ma dla nich osobnej kategorii, więc w najlepszym razie trafiają do szuflady „inne”. Model nie zauważy czegoś, czego nikt go nie nauczył.</w:t>
+      </w:r>
+    </w:p>
+    <w:p>
+      <w:pPr>
+        <w:pStyle w:val="Nagwek1"/>
+        <w:keepNext/>
+        <w:spacing w:before="360" w:after="80"/>
+      </w:pPr>
+      <w:r>
+        <w:t>57. Tryb 3: 19 części twarzy, w tym okulary</w:t>
+      </w:r>
+    </w:p>
+    <w:p>
+      <w:pPr>
+        <w:spacing w:after="160" w:line="300" w:lineRule="exact"/>
+      </w:pPr>
+      <w:r>
+        <w:rPr>
+          <w:color w:val="1E2024"/>
+        </w:rPr>
+        <w:t>Tryb trzeci, model, który zna 19 części twarzy: brwi, oczy, usta, uszy, włosy i okulary. Poproszę, żeby ochotnik zdjął okulary. Napis: brak okularów. A teraz je zakłada. Napis: okulary wykryte, a oprawka obrysowana na turkusowo. Nic tu nie jest doklejone. Model sam ocenia każdy piksel i stwierdza: to jest oprawka. Sprawdźmy, kiedy się pogubi: obrót głowy, zasłonięcie części twarzy dłonią, odsunięcie się od kamery.</w:t>
+      </w:r>
+    </w:p>
+    <w:p>
+      <w:pPr>
+        <w:pStyle w:val="Nagwek1"/>
+        <w:keepNext/>
+        <w:spacing w:before="360" w:after="80"/>
+      </w:pPr>
+      <w:r>
+        <w:t>58. Tryb 4: wszystkie trzy obok siebie</w:t>
+      </w:r>
+    </w:p>
+    <w:p>
+      <w:pPr>
+        <w:spacing w:after="160" w:line="300" w:lineRule="exact"/>
+      </w:pPr>
+      <w:r>
+        <w:rPr>
+          <w:color w:val="1E2024"/>
+        </w:rPr>
+        <w:t>Tryb czwarty, wszystkie trzy obok siebie. Liczby na dole mówią, ile razy na sekundę każda metoda liczy swój wynik. Przy szybkim ruchu widać, że maski sieci lekko spóźniają się za obrazem. Taka jest cena liczenia na zwykłym procesorze.</w:t>
+      </w:r>
+    </w:p>
+    <w:p>
+      <w:pPr>
+        <w:spacing w:after="160" w:line="300" w:lineRule="exact"/>
+      </w:pPr>
+      <w:r>
+        <w:rPr>
+          <w:i/>
+          <w:iCs/>
+          <w:color w:val="6B7178"/>
+          <w:sz w:val="22"/>
+          <w:szCs w:val="22"/>
+        </w:rPr>
+        <w:t xml:space="preserve">[Gdyby kamera nie ruszyła: zmień numer kamery w </w:t>
+      </w:r>
+      <w:proofErr w:type="spellStart"/>
+      <w:r>
+        <w:rPr>
+          <w:i/>
+          <w:iCs/>
+          <w:color w:val="6B7178"/>
+          <w:sz w:val="22"/>
+          <w:szCs w:val="22"/>
+        </w:rPr>
+        <w:t>launcherze</w:t>
+      </w:r>
+      <w:proofErr w:type="spellEnd"/>
+      <w:r>
+        <w:rPr>
+          <w:i/>
+          <w:iCs/>
+          <w:color w:val="6B7178"/>
+          <w:sz w:val="22"/>
+          <w:szCs w:val="22"/>
+        </w:rPr>
+        <w:t>. Jeśli dalej nic, opowiedz wyniki na podstawie tabeli z następnego slajdu.]</w:t>
       </w:r>
     </w:p>
     <w:p>
@@ -1674,7 +2060,21 @@
         <w:rPr>
           <w:color w:val="1E2024"/>
         </w:rPr>
-        <w:t>Model od części twarzy widzi okulary bardzo dokładnie, ale on też ma swoje przyzwyczajenia. Uczył się na zdjęciach celebrytów, na których twarz jest duża i na środku kadru. Przy budowie tego demo wyszło to bardzo wyraźnie. Kiedy dostał cały obraz z kamery, na którym twarz była niewielka, znalazł na okularach 129 pikseli. Kiedy najpierw wycięliśmy samą twarz i ją powiększyliśmy, znalazł ich 2553, czyli tyle, ile trzeba. Ten sam model, bez żadnej zmiany w nim samym, tylko inaczej podany obraz. Dokładnie jak z zaokrąglaniem w Mask R-CNN: wystarczyło znaleźć miejsce, w którym ginęła informacja.</w:t>
+        <w:t xml:space="preserve">Model od części twarzy widzi okulary bardzo dokładnie, ale on też ma swoje przyzwyczajenia. Uczył się na zdjęciach celebrytów, na których twarz jest duża i na środku kadru. Przy budowie tego demo wyszło to bardzo wyraźnie. Kiedy dostał cały obraz z kamery, na którym twarz była niewielka, znalazł na okularach 129 pikseli. Kiedy najpierw wycięliśmy samą twarz i ją powiększyliśmy, znalazł ich 2553, czyli tyle, ile trzeba. Ten sam model, bez żadnej zmiany w nim samym, tylko inaczej podany obraz. Dokładnie jak z zaokrąglaniem w </w:t>
+      </w:r>
+      <w:proofErr w:type="spellStart"/>
+      <w:r>
+        <w:rPr>
+          <w:color w:val="1E2024"/>
+        </w:rPr>
+        <w:t>Mask</w:t>
+      </w:r>
+      <w:proofErr w:type="spellEnd"/>
+      <w:r>
+        <w:rPr>
+          <w:color w:val="1E2024"/>
+        </w:rPr>
+        <w:t xml:space="preserve"> R-CNN: wystarczyło znaleźć miejsce, w którym ginęła informacja.</w:t>
       </w:r>
     </w:p>
     <w:p>
@@ -1768,59 +2168,126 @@
         <w:spacing w:before="360" w:after="80"/>
       </w:pPr>
       <w:r>
-        <w:t>63. IoU: część wspólna podzielona przez całość</w:t>
-      </w:r>
-    </w:p>
-    <w:p>
-      <w:pPr>
-        <w:spacing w:after="160" w:line="300" w:lineRule="exact"/>
-      </w:pPr>
-      <w:r>
-        <w:rPr>
-          <w:color w:val="1E2024"/>
-        </w:rPr>
-        <w:t>Najpopularniejsza miara to IoU. Bierzemy część wspólną obu zaznaczeń i dzielimy przez obszar, który zajmują razem. Tu mamy 9 trafień, 3 fałszywe alarmy i 2 pominięcia, czyli 9 przez 14, mniej więcej 0,64. Jedynka oznaczałaby idealne nałożenie.</w:t>
-      </w:r>
-    </w:p>
-    <w:p>
-      <w:pPr>
-        <w:pStyle w:val="Nagwek1"/>
-        <w:keepNext/>
-        <w:spacing w:before="360" w:after="80"/>
-      </w:pPr>
-      <w:r>
-        <w:t>64. Dice: prawie to samo, ale łagodniej</w:t>
-      </w:r>
-    </w:p>
-    <w:p>
-      <w:pPr>
-        <w:spacing w:after="160" w:line="300" w:lineRule="exact"/>
-      </w:pPr>
-      <w:r>
-        <w:rPr>
-          <w:color w:val="1E2024"/>
-        </w:rPr>
-        <w:t>Druga miara, Dice, liczy prawie to samo, ale łagodniej: część wspólną liczy podwójnie i dzieli przez sumę obu zaznaczeń. Ta sama predykcja daje 0,78. Dla jednego obrazu jedną miarę da się przeliczyć na drugą, więc różnią się głównie tym, gdzie się ich używa.</w:t>
-      </w:r>
-    </w:p>
-    <w:p>
-      <w:pPr>
-        <w:spacing w:after="160" w:line="300" w:lineRule="exact"/>
-      </w:pPr>
-      <w:r>
-        <w:rPr>
-          <w:color w:val="1E2024"/>
-        </w:rPr>
-        <w:t>Dice to standard w medycynie: tak ocenia się zaznaczenia narządów i guzów na tomografii czy rezonansie. Często służy też do samego uczenia sieci, bo nie daje się zdominować ogromnemu tłu. IoU to z kolei standard w zbiorach i konkursach ze zwykłymi zdjęciami, na przykład ulic dla samochodów autonomicznych. Porównując wyniki z dwóch artykułów, warto więc sprawdzić, o której mierze mowa.</w:t>
-      </w:r>
-    </w:p>
-    <w:p>
-      <w:pPr>
-        <w:pStyle w:val="Nagwek1"/>
-        <w:keepNext/>
-        <w:spacing w:before="360" w:after="80"/>
-      </w:pPr>
-      <w:r>
+        <w:t xml:space="preserve">63. </w:t>
+      </w:r>
+      <w:proofErr w:type="spellStart"/>
+      <w:r>
+        <w:t>IoU</w:t>
+      </w:r>
+      <w:proofErr w:type="spellEnd"/>
+      <w:r>
+        <w:t>: część wspólna podzielona przez całość</w:t>
+      </w:r>
+    </w:p>
+    <w:p>
+      <w:pPr>
+        <w:spacing w:after="160" w:line="300" w:lineRule="exact"/>
+      </w:pPr>
+      <w:r>
+        <w:rPr>
+          <w:color w:val="1E2024"/>
+        </w:rPr>
+        <w:t xml:space="preserve">Najpopularniejsza miara to </w:t>
+      </w:r>
+      <w:proofErr w:type="spellStart"/>
+      <w:r>
+        <w:rPr>
+          <w:color w:val="1E2024"/>
+        </w:rPr>
+        <w:t>IoU</w:t>
+      </w:r>
+      <w:proofErr w:type="spellEnd"/>
+      <w:r>
+        <w:rPr>
+          <w:color w:val="1E2024"/>
+        </w:rPr>
+        <w:t>. Bierzemy część wspólną obu zaznaczeń i dzielimy przez obszar, który zajmują razem. Tu mamy 9 trafień, 3 fałszywe alarmy i 2 pominięcia, czyli 9 przez 14, mniej więcej 0,64. Jedynka oznaczałaby idealne nałożenie.</w:t>
+      </w:r>
+    </w:p>
+    <w:p>
+      <w:pPr>
+        <w:pStyle w:val="Nagwek1"/>
+        <w:keepNext/>
+        <w:spacing w:before="360" w:after="80"/>
+      </w:pPr>
+      <w:r>
+        <w:t xml:space="preserve">64. </w:t>
+      </w:r>
+      <w:proofErr w:type="spellStart"/>
+      <w:r>
+        <w:t>Dice</w:t>
+      </w:r>
+      <w:proofErr w:type="spellEnd"/>
+      <w:r>
+        <w:t>: prawie to samo, ale łagodniej</w:t>
+      </w:r>
+    </w:p>
+    <w:p>
+      <w:pPr>
+        <w:spacing w:after="160" w:line="300" w:lineRule="exact"/>
+      </w:pPr>
+      <w:r>
+        <w:rPr>
+          <w:color w:val="1E2024"/>
+        </w:rPr>
+        <w:t xml:space="preserve">Druga miara, </w:t>
+      </w:r>
+      <w:proofErr w:type="spellStart"/>
+      <w:r>
+        <w:rPr>
+          <w:color w:val="1E2024"/>
+        </w:rPr>
+        <w:t>Dice</w:t>
+      </w:r>
+      <w:proofErr w:type="spellEnd"/>
+      <w:r>
+        <w:rPr>
+          <w:color w:val="1E2024"/>
+        </w:rPr>
+        <w:t>, liczy prawie to samo, ale łagodniej: część wspólną liczy podwójnie i dzieli przez sumę obu zaznaczeń. Ta sama predykcja daje 0,78. Dla jednego obrazu jedną miarę da się przeliczyć na drugą, więc różnią się głównie tym, gdzie się ich używa.</w:t>
+      </w:r>
+    </w:p>
+    <w:p>
+      <w:pPr>
+        <w:spacing w:after="160" w:line="300" w:lineRule="exact"/>
+      </w:pPr>
+      <w:proofErr w:type="spellStart"/>
+      <w:r>
+        <w:rPr>
+          <w:color w:val="1E2024"/>
+        </w:rPr>
+        <w:t>Dice</w:t>
+      </w:r>
+      <w:proofErr w:type="spellEnd"/>
+      <w:r>
+        <w:rPr>
+          <w:color w:val="1E2024"/>
+        </w:rPr>
+        <w:t xml:space="preserve"> to standard w medycynie: tak ocenia się zaznaczenia narządów i guzów na tomografii czy rezonansie. Często służy też do samego uczenia sieci, bo nie daje się zdominować ogromnemu tłu. </w:t>
+      </w:r>
+      <w:proofErr w:type="spellStart"/>
+      <w:r>
+        <w:rPr>
+          <w:color w:val="1E2024"/>
+        </w:rPr>
+        <w:t>IoU</w:t>
+      </w:r>
+      <w:proofErr w:type="spellEnd"/>
+      <w:r>
+        <w:rPr>
+          <w:color w:val="1E2024"/>
+        </w:rPr>
+        <w:t xml:space="preserve"> to z kolei standard w zbiorach i konkursach ze zwykłymi zdjęciami, na przykład ulic dla samochodów autonomicznych. Porównując wyniki z dwóch artykułów, warto więc sprawdzić, o której mierze mowa.</w:t>
+      </w:r>
+    </w:p>
+    <w:p>
+      <w:pPr>
+        <w:pStyle w:val="Nagwek1"/>
+        <w:keepNext/>
+        <w:spacing w:before="360" w:after="80"/>
+      </w:pPr>
+      <w:r>
+        <w:lastRenderedPageBreak/>
         <w:t>65. Dokładność: brzmi najlepiej, jest najmniej uczciwa</w:t>
       </w:r>
     </w:p>
@@ -1854,7 +2321,35 @@
         <w:rPr>
           <w:color w:val="1E2024"/>
         </w:rPr>
-        <w:t>Wniosek praktyczny: jedna liczba nigdy nie mówi wszystkiego. W pracach naukowych podaje się kilka miar naraz: IoU albo Dice, żeby ocenić sam obiekt, a dokładność najwyżej jako uzupełnienie.</w:t>
+        <w:t xml:space="preserve">Wniosek praktyczny: jedna liczba nigdy nie mówi wszystkiego. W pracach naukowych podaje się kilka miar naraz: </w:t>
+      </w:r>
+      <w:proofErr w:type="spellStart"/>
+      <w:r>
+        <w:rPr>
+          <w:color w:val="1E2024"/>
+        </w:rPr>
+        <w:t>IoU</w:t>
+      </w:r>
+      <w:proofErr w:type="spellEnd"/>
+      <w:r>
+        <w:rPr>
+          <w:color w:val="1E2024"/>
+        </w:rPr>
+        <w:t xml:space="preserve"> albo </w:t>
+      </w:r>
+      <w:proofErr w:type="spellStart"/>
+      <w:r>
+        <w:rPr>
+          <w:color w:val="1E2024"/>
+        </w:rPr>
+        <w:t>Dice</w:t>
+      </w:r>
+      <w:proofErr w:type="spellEnd"/>
+      <w:r>
+        <w:rPr>
+          <w:color w:val="1E2024"/>
+        </w:rPr>
+        <w:t>, żeby ocenić sam obiekt, a dokładność najwyżej jako uzupełnienie.</w:t>
       </w:r>
     </w:p>
     <w:p>
@@ -1954,7 +2449,21 @@
         <w:rPr>
           <w:color w:val="1E2024"/>
         </w:rPr>
-        <w:t>Jak sobie z tym radzić? Można powiedzieć modelowi, że pomyłka na małym obiekcie kosztuje go dużo więcej niż pomyłka w tle. Można też oceniać go nie piksel po pikselu, tylko po tym, jak dobrze jego zaznaczenie nakłada się na prawdziwe, czyli właśnie miarą Dice z poprzedniego slajdu. Wtedy mały guz liczy się tak samo jak duży.</w:t>
+        <w:t xml:space="preserve">Jak sobie z tym radzić? Można powiedzieć modelowi, że pomyłka na małym obiekcie kosztuje go dużo więcej niż pomyłka w tle. Można też oceniać go nie piksel po pikselu, tylko po tym, jak dobrze jego zaznaczenie nakłada się na prawdziwe, czyli właśnie miarą </w:t>
+      </w:r>
+      <w:proofErr w:type="spellStart"/>
+      <w:r>
+        <w:rPr>
+          <w:color w:val="1E2024"/>
+        </w:rPr>
+        <w:t>Dice</w:t>
+      </w:r>
+      <w:proofErr w:type="spellEnd"/>
+      <w:r>
+        <w:rPr>
+          <w:color w:val="1E2024"/>
+        </w:rPr>
+        <w:t xml:space="preserve"> z poprzedniego slajdu. Wtedy mały guz liczy się tak samo jak duży.</w:t>
       </w:r>
     </w:p>
     <w:p>
@@ -1975,7 +2484,15 @@
         <w:spacing w:before="360" w:after="80"/>
       </w:pPr>
       <w:r>
-        <w:t>70. Cityscapes: zdjęcia ulic z ok. 50 miast</w:t>
+        <w:t xml:space="preserve">70. </w:t>
+      </w:r>
+      <w:proofErr w:type="spellStart"/>
+      <w:r>
+        <w:t>Cityscapes</w:t>
+      </w:r>
+      <w:proofErr w:type="spellEnd"/>
+      <w:r>
+        <w:t>: zdjęcia ulic z ok. 50 miast</w:t>
       </w:r>
     </w:p>
     <w:p>
@@ -2009,53 +2526,106 @@
       <w:pPr>
         <w:spacing w:after="160" w:line="300" w:lineRule="exact"/>
       </w:pPr>
-      <w:r>
-        <w:rPr>
-          <w:color w:val="1E2024"/>
-        </w:rPr>
-        <w:t>Cityscapes to zdjęcia ulic z około pięćdziesięciu miast, głównie niemieckich. Pięć tysięcy z nich zaznaczono bardzo dokładnie. Dla wyobrażenia, ile to pracy: zaznaczenie jednego takiego zdjęcia zajmowało człowiekowi średnio ponad półtorej godziny.</w:t>
-      </w:r>
-    </w:p>
-    <w:p>
-      <w:pPr>
-        <w:pStyle w:val="Nagwek1"/>
-        <w:keepNext/>
-        <w:spacing w:before="360" w:after="80"/>
-      </w:pPr>
-      <w:r>
-        <w:t>71. ADE20K i COCO-Stuff: przedmioty i tło</w:t>
-      </w:r>
-    </w:p>
-    <w:p>
-      <w:pPr>
-        <w:spacing w:after="160" w:line="300" w:lineRule="exact"/>
-      </w:pPr>
-      <w:r>
-        <w:rPr>
-          <w:color w:val="1E2024"/>
-        </w:rPr>
-        <w:t>ADE20K to zdjęcia przeróżnych miejsc, od kuchni po plaże, ze stu pięćdziesięcioma rodzajami obiektów. COCO-Stuff to zdjęcia z życia codziennego, na których zaznaczono zarówno przedmioty, jak i tło: niebo, trawę, ściany.</w:t>
-      </w:r>
-    </w:p>
-    <w:p>
-      <w:pPr>
-        <w:pStyle w:val="Nagwek1"/>
-        <w:keepNext/>
-        <w:spacing w:before="360" w:after="80"/>
-      </w:pPr>
-      <w:r>
-        <w:t>72. CelebAMask-HQ: 30 000 twarzy, 19 części</w:t>
-      </w:r>
-    </w:p>
-    <w:p>
-      <w:pPr>
-        <w:spacing w:after="160" w:line="300" w:lineRule="exact"/>
-      </w:pPr>
-      <w:r>
-        <w:rPr>
-          <w:color w:val="1E2024"/>
-        </w:rPr>
-        <w:t>I CelebAMask-HQ: trzydzieści tysięcy zdjęć twarzy, na których ręcznie zaznaczono 19 części, w tym okulary. Na nim uczył się model z trybu trzeciego. Dlatego widział okulary, a sieć z trybu drugiego, uczona na innych danych, nie.</w:t>
+      <w:proofErr w:type="spellStart"/>
+      <w:r>
+        <w:rPr>
+          <w:color w:val="1E2024"/>
+        </w:rPr>
+        <w:lastRenderedPageBreak/>
+        <w:t>Cityscapes</w:t>
+      </w:r>
+      <w:proofErr w:type="spellEnd"/>
+      <w:r>
+        <w:rPr>
+          <w:color w:val="1E2024"/>
+        </w:rPr>
+        <w:t xml:space="preserve"> to zdjęcia ulic z około pięćdziesięciu miast, głównie niemieckich. Pięć tysięcy z nich zaznaczono bardzo dokładnie. Dla wyobrażenia, ile to pracy: zaznaczenie jednego takiego zdjęcia zajmowało człowiekowi średnio ponad półtorej godziny.</w:t>
+      </w:r>
+    </w:p>
+    <w:p>
+      <w:pPr>
+        <w:pStyle w:val="Nagwek1"/>
+        <w:keepNext/>
+        <w:spacing w:before="360" w:after="80"/>
+      </w:pPr>
+      <w:r>
+        <w:t>71. ADE20K i COCO-</w:t>
+      </w:r>
+      <w:proofErr w:type="spellStart"/>
+      <w:r>
+        <w:t>Stuff</w:t>
+      </w:r>
+      <w:proofErr w:type="spellEnd"/>
+      <w:r>
+        <w:t>: przedmioty i tło</w:t>
+      </w:r>
+    </w:p>
+    <w:p>
+      <w:pPr>
+        <w:spacing w:after="160" w:line="300" w:lineRule="exact"/>
+      </w:pPr>
+      <w:r>
+        <w:rPr>
+          <w:color w:val="1E2024"/>
+        </w:rPr>
+        <w:t>ADE20K to zdjęcia przeróżnych miejsc, od kuchni po plaże, ze stu pięćdziesięcioma rodzajami obiektów. COCO-</w:t>
+      </w:r>
+      <w:proofErr w:type="spellStart"/>
+      <w:r>
+        <w:rPr>
+          <w:color w:val="1E2024"/>
+        </w:rPr>
+        <w:t>Stuff</w:t>
+      </w:r>
+      <w:proofErr w:type="spellEnd"/>
+      <w:r>
+        <w:rPr>
+          <w:color w:val="1E2024"/>
+        </w:rPr>
+        <w:t xml:space="preserve"> to zdjęcia z życia codziennego, na których zaznaczono zarówno przedmioty, jak i tło: niebo, trawę, ściany.</w:t>
+      </w:r>
+    </w:p>
+    <w:p>
+      <w:pPr>
+        <w:pStyle w:val="Nagwek1"/>
+        <w:keepNext/>
+        <w:spacing w:before="360" w:after="80"/>
+      </w:pPr>
+      <w:r>
+        <w:t xml:space="preserve">72. </w:t>
+      </w:r>
+      <w:proofErr w:type="spellStart"/>
+      <w:r>
+        <w:t>CelebAMask</w:t>
+      </w:r>
+      <w:proofErr w:type="spellEnd"/>
+      <w:r>
+        <w:t>-HQ: 30 000 twarzy, 19 części</w:t>
+      </w:r>
+    </w:p>
+    <w:p>
+      <w:pPr>
+        <w:spacing w:after="160" w:line="300" w:lineRule="exact"/>
+      </w:pPr>
+      <w:r>
+        <w:rPr>
+          <w:color w:val="1E2024"/>
+        </w:rPr>
+        <w:t xml:space="preserve">I </w:t>
+      </w:r>
+      <w:proofErr w:type="spellStart"/>
+      <w:r>
+        <w:rPr>
+          <w:color w:val="1E2024"/>
+        </w:rPr>
+        <w:t>CelebAMask</w:t>
+      </w:r>
+      <w:proofErr w:type="spellEnd"/>
+      <w:r>
+        <w:rPr>
+          <w:color w:val="1E2024"/>
+        </w:rPr>
+        <w:t>-HQ: trzydzieści tysięcy zdjęć twarzy, na których ręcznie zaznaczono 19 części, w tym okulary. Na nim uczył się model z trybu trzeciego. Dlatego widział okulary, a sieć z trybu drugiego, uczona na innych danych, nie.</w:t>
       </w:r>
     </w:p>
     <w:p>
@@ -2197,7 +2767,14 @@
         <w:rPr>
           <w:color w:val="1E2024"/>
         </w:rPr>
-        <w:t>Po trzecie: szybkość. Przykład z przygotowania tego wykładu: duży, bardzo dokładny model do twarzy liczył jedną klatkę przez 1,2 sekundy. Ten, którego używaliśmy w demo, jest mniejszy: na zwykłym laptopie robi około sześciu klatek na sekundę, czyli jedna zajmuje mu mniej więcej jedną szóstą sekundy. Widzieliście tę liczbę na ekranie podczas pokazu.</w:t>
+        <w:t xml:space="preserve">Po trzecie: szybkość. Przykład z przygotowania tego wykładu: duży, bardzo dokładny model do twarzy liczył jedną klatkę przez 1,2 sekundy. Ten, którego używaliśmy w demo, jest mniejszy: na </w:t>
+      </w:r>
+      <w:r>
+        <w:rPr>
+          <w:color w:val="1E2024"/>
+        </w:rPr>
+        <w:lastRenderedPageBreak/>
+        <w:t>zwykłym laptopie robi około sześciu klatek na sekundę, czyli jedna zajmuje mu mniej więcej jedną szóstą sekundy. Widzieliście tę liczbę na ekranie podczas pokazu.</w:t>
       </w:r>
     </w:p>
     <w:p>
@@ -2260,8 +2837,13 @@
         <w:spacing w:before="360" w:after="80"/>
       </w:pPr>
       <w:r>
-        <w:t>81. Tryb portretowy i tło w wideorozmowie</w:t>
-      </w:r>
+        <w:t xml:space="preserve">81. Tryb portretowy i tło w </w:t>
+      </w:r>
+      <w:proofErr w:type="spellStart"/>
+      <w:r>
+        <w:t>wideorozmowie</w:t>
+      </w:r>
+      <w:proofErr w:type="spellEnd"/>
     </w:p>
     <w:p>
       <w:pPr>
@@ -2298,7 +2880,21 @@
         <w:rPr>
           <w:color w:val="1E2024"/>
         </w:rPr>
-        <w:t>Tryb portretowy w telefonie: telefon wycina osobę i rozmywa wszystko za nią. Rozmyte albo podmienione tło w wideorozmowie: to samo, tylko kilkadziesiąt razy na sekundę, często modelem bardzo podobnym do tego z trybu drugiego.</w:t>
+        <w:t xml:space="preserve">Tryb portretowy w telefonie: telefon wycina osobę i rozmywa wszystko za nią. Rozmyte albo podmienione tło w </w:t>
+      </w:r>
+      <w:proofErr w:type="spellStart"/>
+      <w:r>
+        <w:rPr>
+          <w:color w:val="1E2024"/>
+        </w:rPr>
+        <w:t>wideorozmowie</w:t>
+      </w:r>
+      <w:proofErr w:type="spellEnd"/>
+      <w:r>
+        <w:rPr>
+          <w:color w:val="1E2024"/>
+        </w:rPr>
+        <w:t>: to samo, tylko kilkadziesiąt razy na sekundę, często modelem bardzo podobnym do tego z trybu drugiego.</w:t>
       </w:r>
     </w:p>
     <w:p>
@@ -2340,7 +2936,21 @@
         <w:rPr>
           <w:color w:val="1E2024"/>
         </w:rPr>
-        <w:t>Samochód autonomiczny musi w każdej chwili wiedzieć, gdzie jest jezdnia, gdzie chodnik, a gdzie pieszy. W medycynie lekarz zaznacza guz na skanie, żeby zmierzyć, czy po leczeniu się zmniejszył, a segmentacja może tę pracę przyspieszyć. A budynki, drogi i lasy, które widzicie na mapach w internecie, w dużej części zostały wyodrębnione ze zdjęć satelitarnych właśnie w ten sposób.</w:t>
+        <w:t xml:space="preserve">Samochód autonomiczny musi w każdej chwili wiedzieć, gdzie jest jezdnia, gdzie chodnik, a gdzie pieszy. W medycynie lekarz zaznacza guz na skanie, żeby zmierzyć, czy po leczeniu się zmniejszył, a segmentacja może tę pracę przyspieszyć. A budynki, drogi i lasy, które widzicie na mapach w </w:t>
+      </w:r>
+      <w:proofErr w:type="spellStart"/>
+      <w:r>
+        <w:rPr>
+          <w:color w:val="1E2024"/>
+        </w:rPr>
+        <w:t>internecie</w:t>
+      </w:r>
+      <w:proofErr w:type="spellEnd"/>
+      <w:r>
+        <w:rPr>
+          <w:color w:val="1E2024"/>
+        </w:rPr>
+        <w:t>, w dużej części zostały wyodrębnione ze zdjęć satelitarnych właśnie w ten sposób.</w:t>
       </w:r>
     </w:p>
     <w:p>
@@ -2361,16 +2971,31 @@
         <w:rPr>
           <w:color w:val="1E2024"/>
         </w:rPr>
-        <w:t>Zauważcie, że pomyłki nie są tu równie groźne. Jeśli w wideorozmowie zniknie wam kawałek ręki, nic się nie stanie. Jeśli samochód nie zauważy pieszego albo program źle zaznaczy granicę guza, konsekwencje są poważne. Dlatego przy każdym takim systemie warto pytać nie tylko, jak często się myli, ale też jakie błędy popełnia.</w:t>
-      </w:r>
-    </w:p>
-    <w:p>
-      <w:pPr>
-        <w:pStyle w:val="Nagwek1"/>
-        <w:keepNext/>
-        <w:spacing w:before="360" w:after="80"/>
-      </w:pPr>
-      <w:r>
+        <w:t xml:space="preserve">Zauważcie, że pomyłki nie są tu równie groźne. Jeśli w </w:t>
+      </w:r>
+      <w:proofErr w:type="spellStart"/>
+      <w:r>
+        <w:rPr>
+          <w:color w:val="1E2024"/>
+        </w:rPr>
+        <w:t>wideorozmowie</w:t>
+      </w:r>
+      <w:proofErr w:type="spellEnd"/>
+      <w:r>
+        <w:rPr>
+          <w:color w:val="1E2024"/>
+        </w:rPr>
+        <w:t xml:space="preserve"> zniknie wam kawałek ręki, nic się nie stanie. Jeśli samochód nie zauważy pieszego albo program źle zaznaczy granicę guza, konsekwencje są poważne. Dlatego przy każdym takim systemie warto pytać nie tylko, jak często się myli, ale też jakie błędy popełnia.</w:t>
+      </w:r>
+    </w:p>
+    <w:p>
+      <w:pPr>
+        <w:pStyle w:val="Nagwek1"/>
+        <w:keepNext/>
+        <w:spacing w:before="360" w:after="80"/>
+      </w:pPr>
+      <w:r>
+        <w:lastRenderedPageBreak/>
         <w:t>85. Ten sam obraz. Inna odpowiedź.</w:t>
       </w:r>
     </w:p>
@@ -2510,7 +3135,21 @@
         <w:rPr>
           <w:color w:val="1E2024"/>
         </w:rPr>
-        <w:t>Cały kod dzisiejszego demo jest w repozytorium segmentation_presentation. Działa na zwykłym laptopie, więc można go uruchomić u siebie i sprawdzić, kiedy te modele się mylą.</w:t>
+        <w:t xml:space="preserve">Cały kod dzisiejszego demo jest w repozytorium </w:t>
+      </w:r>
+      <w:proofErr w:type="spellStart"/>
+      <w:r>
+        <w:rPr>
+          <w:color w:val="1E2024"/>
+        </w:rPr>
+        <w:t>segmentation_presentation</w:t>
+      </w:r>
+      <w:proofErr w:type="spellEnd"/>
+      <w:r>
+        <w:rPr>
+          <w:color w:val="1E2024"/>
+        </w:rPr>
+        <w:t>. Działa na zwykłym laptopie, więc można go uruchomić u siebie i sprawdzić, kiedy te modele się mylą.</w:t>
       </w:r>
     </w:p>
     <w:p>

</xml_diff>